<commit_message>
Xuất 9 tờ trình sang Word với dữ liệu mẫu; bảng ngắn không bị tách trang
- templates/07-to-trinh-lanh-dao: 9 tờ trình Word (thể thức NĐ 30/2020) có dữ liệu mẫu TURBO tô vàng
- Dữ liệu mẫu: trình tự hợp lý (IT trình chủ trương 25/08 → lập Phòng ANM → Quy chế 08/09
  → Hội đồng 26/09 → kinh phí, kiểm thử, đào tạo), số hiệu tờ trình và quyết định không trùng,
  kinh phí từng dòng cộng khớp tổng
- md2docx: bảng ≤ 8 dòng giữ liền một trang; cột có tiêu đề dài không bị ép quá hẹp
- templates/README.md: thêm nhóm tờ trình

Co-Authored-By: Claude Opus 5.5 <noreply@anthropic.com>
Claude-Session: https://claude.ai/code/session_01EYfrLZFALxho7iwpK7bTVa
</commit_message>
<xml_diff>
--- a/templates/01-xac-dinh-cap-do/phieu-xac-dinh-cap-do.docx
+++ b/templates/01-xac-dinh-cap-do/phieu-xac-dinh-cap-do.docx
@@ -65,6 +65,7 @@
           </w:tcPr>
           <w:p>
             <w:pPr>
+              <w:keepNext w:val="false"/>
               <w:spacing w:after="0" w:before="0" w:line="240" w:lineRule="auto"/>
               <w:jc w:val="center"/>
             </w:pPr>
@@ -102,6 +103,7 @@
           </w:tcPr>
           <w:p>
             <w:pPr>
+              <w:keepNext w:val="false"/>
               <w:spacing w:after="0" w:before="0" w:line="240" w:lineRule="auto"/>
               <w:jc w:val="center"/>
             </w:pPr>
@@ -139,6 +141,7 @@
           </w:tcPr>
           <w:p>
             <w:pPr>
+              <w:keepNext w:val="false"/>
               <w:spacing w:after="0" w:before="0" w:line="240" w:lineRule="auto"/>
               <w:jc w:val="center"/>
             </w:pPr>
@@ -181,6 +184,7 @@
           </w:tcPr>
           <w:p>
             <w:pPr>
+              <w:keepNext w:val="false"/>
               <w:spacing w:after="0" w:before="0" w:line="240" w:lineRule="auto"/>
               <w:jc w:val="left"/>
             </w:pPr>
@@ -217,6 +221,7 @@
           </w:tcPr>
           <w:p>
             <w:pPr>
+              <w:keepNext w:val="false"/>
               <w:spacing w:after="0" w:before="0" w:line="240" w:lineRule="auto"/>
               <w:jc w:val="left"/>
             </w:pPr>
@@ -254,6 +259,7 @@
           </w:tcPr>
           <w:p>
             <w:pPr>
+              <w:keepNext w:val="false"/>
               <w:spacing w:after="0" w:before="0" w:line="240" w:lineRule="auto"/>
               <w:jc w:val="left"/>
             </w:pPr>
@@ -296,6 +302,7 @@
           </w:tcPr>
           <w:p>
             <w:pPr>
+              <w:keepNext w:val="false"/>
               <w:spacing w:after="0" w:before="0" w:line="240" w:lineRule="auto"/>
               <w:jc w:val="left"/>
             </w:pPr>
@@ -332,6 +339,7 @@
           </w:tcPr>
           <w:p>
             <w:pPr>
+              <w:keepNext w:val="false"/>
               <w:spacing w:after="0" w:before="0" w:line="240" w:lineRule="auto"/>
               <w:jc w:val="left"/>
             </w:pPr>
@@ -369,6 +377,7 @@
           </w:tcPr>
           <w:p>
             <w:pPr>
+              <w:keepNext w:val="false"/>
               <w:spacing w:after="0" w:before="0" w:line="240" w:lineRule="auto"/>
               <w:jc w:val="left"/>
             </w:pPr>
@@ -411,6 +420,7 @@
           </w:tcPr>
           <w:p>
             <w:pPr>
+              <w:keepNext w:val="false"/>
               <w:spacing w:after="0" w:before="0" w:line="240" w:lineRule="auto"/>
               <w:jc w:val="left"/>
             </w:pPr>
@@ -447,6 +457,7 @@
           </w:tcPr>
           <w:p>
             <w:pPr>
+              <w:keepNext w:val="false"/>
               <w:spacing w:after="0" w:before="0" w:line="240" w:lineRule="auto"/>
               <w:jc w:val="left"/>
             </w:pPr>
@@ -509,6 +520,7 @@
           </w:tcPr>
           <w:p>
             <w:pPr>
+              <w:keepNext w:val="false"/>
               <w:spacing w:after="0" w:before="0" w:line="240" w:lineRule="auto"/>
               <w:jc w:val="left"/>
             </w:pPr>
@@ -551,6 +563,7 @@
           </w:tcPr>
           <w:p>
             <w:pPr>
+              <w:keepNext w:val="false"/>
               <w:spacing w:after="0" w:before="0" w:line="240" w:lineRule="auto"/>
               <w:jc w:val="left"/>
             </w:pPr>
@@ -587,6 +600,7 @@
           </w:tcPr>
           <w:p>
             <w:pPr>
+              <w:keepNext w:val="false"/>
               <w:spacing w:after="0" w:before="0" w:line="240" w:lineRule="auto"/>
               <w:jc w:val="left"/>
             </w:pPr>
@@ -661,6 +675,7 @@
           </w:tcPr>
           <w:p>
             <w:pPr>
+              <w:keepNext w:val="false"/>
               <w:spacing w:after="0" w:before="0" w:line="240" w:lineRule="auto"/>
               <w:jc w:val="left"/>
             </w:pPr>
@@ -703,6 +718,7 @@
           </w:tcPr>
           <w:p>
             <w:pPr>
+              <w:keepNext w:val="false"/>
               <w:spacing w:after="0" w:before="0" w:line="240" w:lineRule="auto"/>
               <w:jc w:val="left"/>
             </w:pPr>
@@ -739,6 +755,7 @@
           </w:tcPr>
           <w:p>
             <w:pPr>
+              <w:keepNext w:val="false"/>
               <w:spacing w:after="0" w:before="0" w:line="240" w:lineRule="auto"/>
               <w:jc w:val="left"/>
             </w:pPr>
@@ -776,6 +793,7 @@
           </w:tcPr>
           <w:p>
             <w:pPr>
+              <w:keepNext w:val="false"/>
               <w:spacing w:after="0" w:before="0" w:line="240" w:lineRule="auto"/>
               <w:jc w:val="left"/>
             </w:pPr>
@@ -818,6 +836,7 @@
           </w:tcPr>
           <w:p>
             <w:pPr>
+              <w:keepNext w:val="false"/>
               <w:spacing w:after="0" w:before="0" w:line="240" w:lineRule="auto"/>
               <w:jc w:val="left"/>
             </w:pPr>
@@ -854,6 +873,7 @@
           </w:tcPr>
           <w:p>
             <w:pPr>
+              <w:keepNext w:val="false"/>
               <w:spacing w:after="0" w:before="0" w:line="240" w:lineRule="auto"/>
               <w:jc w:val="left"/>
             </w:pPr>
@@ -891,6 +911,7 @@
           </w:tcPr>
           <w:p>
             <w:pPr>
+              <w:keepNext w:val="false"/>
               <w:spacing w:after="0" w:before="0" w:line="240" w:lineRule="auto"/>
               <w:jc w:val="left"/>
             </w:pPr>
@@ -933,6 +954,7 @@
           </w:tcPr>
           <w:p>
             <w:pPr>
+              <w:keepNext w:val="false"/>
               <w:spacing w:after="0" w:before="0" w:line="240" w:lineRule="auto"/>
               <w:jc w:val="left"/>
             </w:pPr>
@@ -969,6 +991,7 @@
           </w:tcPr>
           <w:p>
             <w:pPr>
+              <w:keepNext w:val="false"/>
               <w:spacing w:after="0" w:before="0" w:line="240" w:lineRule="auto"/>
               <w:jc w:val="left"/>
             </w:pPr>
@@ -1055,6 +1078,7 @@
           </w:tcPr>
           <w:p>
             <w:pPr>
+              <w:keepNext w:val="false"/>
               <w:spacing w:after="0" w:before="0" w:line="240" w:lineRule="auto"/>
               <w:jc w:val="left"/>
             </w:pPr>
@@ -1097,6 +1121,7 @@
           </w:tcPr>
           <w:p>
             <w:pPr>
+              <w:keepNext w:val="false"/>
               <w:spacing w:after="0" w:before="0" w:line="240" w:lineRule="auto"/>
               <w:jc w:val="left"/>
             </w:pPr>
@@ -1133,6 +1158,7 @@
           </w:tcPr>
           <w:p>
             <w:pPr>
+              <w:keepNext w:val="false"/>
               <w:spacing w:after="0" w:before="0" w:line="240" w:lineRule="auto"/>
               <w:jc w:val="left"/>
             </w:pPr>
@@ -1170,6 +1196,7 @@
           </w:tcPr>
           <w:p>
             <w:pPr>
+              <w:keepNext w:val="false"/>
               <w:spacing w:after="0" w:before="0" w:line="240" w:lineRule="auto"/>
               <w:jc w:val="left"/>
             </w:pPr>
@@ -1212,6 +1239,7 @@
           </w:tcPr>
           <w:p>
             <w:pPr>
+              <w:keepNext w:val="false"/>
               <w:spacing w:after="0" w:before="0" w:line="240" w:lineRule="auto"/>
               <w:jc w:val="left"/>
             </w:pPr>
@@ -1248,6 +1276,7 @@
           </w:tcPr>
           <w:p>
             <w:pPr>
+              <w:keepNext w:val="false"/>
               <w:spacing w:after="0" w:before="0" w:line="240" w:lineRule="auto"/>
               <w:jc w:val="left"/>
             </w:pPr>
@@ -1284,6 +1313,7 @@
           </w:tcPr>
           <w:p>
             <w:pPr>
+              <w:keepNext w:val="false"/>
               <w:spacing w:after="0" w:before="0" w:line="240" w:lineRule="auto"/>
               <w:jc w:val="left"/>
             </w:pPr>
@@ -1326,6 +1356,7 @@
           </w:tcPr>
           <w:p>
             <w:pPr>
+              <w:keepNext w:val="false"/>
               <w:spacing w:after="0" w:before="0" w:line="240" w:lineRule="auto"/>
               <w:jc w:val="left"/>
             </w:pPr>
@@ -1362,6 +1393,7 @@
           </w:tcPr>
           <w:p>
             <w:pPr>
+              <w:keepNext w:val="false"/>
               <w:spacing w:after="0" w:before="0" w:line="240" w:lineRule="auto"/>
               <w:jc w:val="left"/>
             </w:pPr>
@@ -1461,6 +1493,7 @@
           </w:tcPr>
           <w:p>
             <w:pPr>
+              <w:keepNext w:val="false"/>
               <w:spacing w:after="0" w:before="0" w:line="240" w:lineRule="auto"/>
               <w:jc w:val="left"/>
             </w:pPr>
@@ -1503,6 +1536,7 @@
           </w:tcPr>
           <w:p>
             <w:pPr>
+              <w:keepNext w:val="false"/>
               <w:spacing w:after="0" w:before="0" w:line="240" w:lineRule="auto"/>
               <w:jc w:val="left"/>
             </w:pPr>
@@ -1539,6 +1573,7 @@
           </w:tcPr>
           <w:p>
             <w:pPr>
+              <w:keepNext w:val="false"/>
               <w:spacing w:after="0" w:before="0" w:line="240" w:lineRule="auto"/>
               <w:jc w:val="left"/>
             </w:pPr>
@@ -1576,6 +1611,7 @@
           </w:tcPr>
           <w:p>
             <w:pPr>
+              <w:keepNext w:val="false"/>
               <w:spacing w:after="0" w:before="0" w:line="240" w:lineRule="auto"/>
               <w:jc w:val="left"/>
             </w:pPr>
@@ -1618,6 +1654,7 @@
           </w:tcPr>
           <w:p>
             <w:pPr>
+              <w:keepNext w:val="false"/>
               <w:spacing w:after="0" w:before="0" w:line="240" w:lineRule="auto"/>
               <w:jc w:val="left"/>
             </w:pPr>
@@ -1654,6 +1691,7 @@
           </w:tcPr>
           <w:p>
             <w:pPr>
+              <w:keepNext w:val="false"/>
               <w:spacing w:after="0" w:before="0" w:line="240" w:lineRule="auto"/>
               <w:jc w:val="left"/>
             </w:pPr>
@@ -1690,6 +1728,7 @@
           </w:tcPr>
           <w:p>
             <w:pPr>
+              <w:keepNext w:val="false"/>
               <w:spacing w:after="0" w:before="0" w:line="240" w:lineRule="auto"/>
               <w:jc w:val="left"/>
             </w:pPr>
@@ -1732,6 +1771,7 @@
           </w:tcPr>
           <w:p>
             <w:pPr>
+              <w:keepNext w:val="false"/>
               <w:spacing w:after="0" w:before="0" w:line="240" w:lineRule="auto"/>
               <w:jc w:val="left"/>
             </w:pPr>
@@ -1768,6 +1808,7 @@
           </w:tcPr>
           <w:p>
             <w:pPr>
+              <w:keepNext w:val="false"/>
               <w:spacing w:after="0" w:before="0" w:line="240" w:lineRule="auto"/>
               <w:jc w:val="left"/>
             </w:pPr>
@@ -1854,6 +1895,7 @@
           </w:tcPr>
           <w:p>
             <w:pPr>
+              <w:keepNext w:val="false"/>
               <w:spacing w:after="0" w:before="0" w:line="240" w:lineRule="auto"/>
               <w:jc w:val="left"/>
             </w:pPr>
@@ -2065,9 +2107,9 @@
         <w:tblLayout w:type="autofit"/>
       </w:tblPr>
       <w:tblGrid>
-        <w:gridCol w:w="2306"/>
-        <w:gridCol w:w="2161"/>
-        <w:gridCol w:w="4558"/>
+        <w:gridCol w:w="2796"/>
+        <w:gridCol w:w="1830"/>
+        <w:gridCol w:w="4399"/>
       </w:tblGrid>
       <w:tr>
         <w:trPr>
@@ -2076,7 +2118,7 @@
         </w:trPr>
         <w:tc>
           <w:tcPr>
-            <w:tcW w:type="dxa" w:w="2306"/>
+            <w:tcW w:type="dxa" w:w="2796"/>
             <w:tcBorders>
               <w:top w:val="single" w:color="000000" w:sz="4"/>
               <w:left w:val="single" w:color="000000" w:sz="4"/>
@@ -2094,6 +2136,7 @@
           </w:tcPr>
           <w:p>
             <w:pPr>
+              <w:keepNext/>
               <w:spacing w:after="0" w:before="0" w:line="240" w:lineRule="auto"/>
               <w:jc w:val="center"/>
             </w:pPr>
@@ -2113,7 +2156,7 @@
         </w:tc>
         <w:tc>
           <w:tcPr>
-            <w:tcW w:type="dxa" w:w="2161"/>
+            <w:tcW w:type="dxa" w:w="1830"/>
             <w:tcBorders>
               <w:top w:val="single" w:color="000000" w:sz="4"/>
               <w:left w:val="single" w:color="000000" w:sz="4"/>
@@ -2131,6 +2174,7 @@
           </w:tcPr>
           <w:p>
             <w:pPr>
+              <w:keepNext/>
               <w:spacing w:after="0" w:before="0" w:line="240" w:lineRule="auto"/>
               <w:jc w:val="center"/>
             </w:pPr>
@@ -2150,7 +2194,7 @@
         </w:tc>
         <w:tc>
           <w:tcPr>
-            <w:tcW w:type="dxa" w:w="4558"/>
+            <w:tcW w:type="dxa" w:w="4399"/>
             <w:tcBorders>
               <w:top w:val="single" w:color="000000" w:sz="4"/>
               <w:left w:val="single" w:color="000000" w:sz="4"/>
@@ -2168,6 +2212,7 @@
           </w:tcPr>
           <w:p>
             <w:pPr>
+              <w:keepNext/>
               <w:spacing w:after="0" w:before="0" w:line="240" w:lineRule="auto"/>
               <w:jc w:val="center"/>
             </w:pPr>
@@ -2193,23 +2238,24 @@
         </w:trPr>
         <w:tc>
           <w:tcPr>
-            <w:tcW w:type="dxa" w:w="2306"/>
-            <w:tcBorders>
-              <w:top w:val="single" w:color="000000" w:sz="4"/>
-              <w:left w:val="single" w:color="000000" w:sz="4"/>
-              <w:bottom w:val="single" w:color="000000" w:sz="4"/>
-              <w:right w:val="single" w:color="000000" w:sz="4"/>
-            </w:tcBorders>
-            <w:tcMar>
-              <w:top w:type="dxa" w:w="30"/>
-              <w:left w:type="dxa" w:w="70"/>
-              <w:bottom w:type="dxa" w:w="30"/>
-              <w:right w:type="dxa" w:w="70"/>
-            </w:tcMar>
-            <w:vAlign w:val="center"/>
-          </w:tcPr>
-          <w:p>
-            <w:pPr>
+            <w:tcW w:type="dxa" w:w="2796"/>
+            <w:tcBorders>
+              <w:top w:val="single" w:color="000000" w:sz="4"/>
+              <w:left w:val="single" w:color="000000" w:sz="4"/>
+              <w:bottom w:val="single" w:color="000000" w:sz="4"/>
+              <w:right w:val="single" w:color="000000" w:sz="4"/>
+            </w:tcBorders>
+            <w:tcMar>
+              <w:top w:type="dxa" w:w="30"/>
+              <w:left w:type="dxa" w:w="70"/>
+              <w:bottom w:type="dxa" w:w="30"/>
+              <w:right w:type="dxa" w:w="70"/>
+            </w:tcMar>
+            <w:vAlign w:val="center"/>
+          </w:tcPr>
+          <w:p>
+            <w:pPr>
+              <w:keepNext/>
               <w:spacing w:after="0" w:before="0" w:line="240" w:lineRule="auto"/>
               <w:jc w:val="left"/>
             </w:pPr>
@@ -2230,23 +2276,24 @@
         </w:tc>
         <w:tc>
           <w:tcPr>
-            <w:tcW w:type="dxa" w:w="2161"/>
-            <w:tcBorders>
-              <w:top w:val="single" w:color="000000" w:sz="4"/>
-              <w:left w:val="single" w:color="000000" w:sz="4"/>
-              <w:bottom w:val="single" w:color="000000" w:sz="4"/>
-              <w:right w:val="single" w:color="000000" w:sz="4"/>
-            </w:tcBorders>
-            <w:tcMar>
-              <w:top w:type="dxa" w:w="30"/>
-              <w:left w:type="dxa" w:w="70"/>
-              <w:bottom w:type="dxa" w:w="30"/>
-              <w:right w:type="dxa" w:w="70"/>
-            </w:tcMar>
-            <w:vAlign w:val="center"/>
-          </w:tcPr>
-          <w:p>
-            <w:pPr>
+            <w:tcW w:type="dxa" w:w="1830"/>
+            <w:tcBorders>
+              <w:top w:val="single" w:color="000000" w:sz="4"/>
+              <w:left w:val="single" w:color="000000" w:sz="4"/>
+              <w:bottom w:val="single" w:color="000000" w:sz="4"/>
+              <w:right w:val="single" w:color="000000" w:sz="4"/>
+            </w:tcBorders>
+            <w:tcMar>
+              <w:top w:type="dxa" w:w="30"/>
+              <w:left w:type="dxa" w:w="70"/>
+              <w:bottom w:type="dxa" w:w="30"/>
+              <w:right w:type="dxa" w:w="70"/>
+            </w:tcMar>
+            <w:vAlign w:val="center"/>
+          </w:tcPr>
+          <w:p>
+            <w:pPr>
+              <w:keepNext/>
               <w:spacing w:after="0" w:before="0" w:line="240" w:lineRule="auto"/>
               <w:jc w:val="left"/>
             </w:pPr>
@@ -2267,23 +2314,24 @@
         </w:tc>
         <w:tc>
           <w:tcPr>
-            <w:tcW w:type="dxa" w:w="4558"/>
-            <w:tcBorders>
-              <w:top w:val="single" w:color="000000" w:sz="4"/>
-              <w:left w:val="single" w:color="000000" w:sz="4"/>
-              <w:bottom w:val="single" w:color="000000" w:sz="4"/>
-              <w:right w:val="single" w:color="000000" w:sz="4"/>
-            </w:tcBorders>
-            <w:tcMar>
-              <w:top w:type="dxa" w:w="30"/>
-              <w:left w:type="dxa" w:w="70"/>
-              <w:bottom w:type="dxa" w:w="30"/>
-              <w:right w:type="dxa" w:w="70"/>
-            </w:tcMar>
-            <w:vAlign w:val="center"/>
-          </w:tcPr>
-          <w:p>
-            <w:pPr>
+            <w:tcW w:type="dxa" w:w="4399"/>
+            <w:tcBorders>
+              <w:top w:val="single" w:color="000000" w:sz="4"/>
+              <w:left w:val="single" w:color="000000" w:sz="4"/>
+              <w:bottom w:val="single" w:color="000000" w:sz="4"/>
+              <w:right w:val="single" w:color="000000" w:sz="4"/>
+            </w:tcBorders>
+            <w:tcMar>
+              <w:top w:type="dxa" w:w="30"/>
+              <w:left w:type="dxa" w:w="70"/>
+              <w:bottom w:type="dxa" w:w="30"/>
+              <w:right w:type="dxa" w:w="70"/>
+            </w:tcMar>
+            <w:vAlign w:val="center"/>
+          </w:tcPr>
+          <w:p>
+            <w:pPr>
+              <w:keepNext/>
               <w:spacing w:after="0" w:before="0" w:line="240" w:lineRule="auto"/>
               <w:jc w:val="left"/>
             </w:pPr>
@@ -2309,23 +2357,24 @@
         </w:trPr>
         <w:tc>
           <w:tcPr>
-            <w:tcW w:type="dxa" w:w="2306"/>
-            <w:tcBorders>
-              <w:top w:val="single" w:color="000000" w:sz="4"/>
-              <w:left w:val="single" w:color="000000" w:sz="4"/>
-              <w:bottom w:val="single" w:color="000000" w:sz="4"/>
-              <w:right w:val="single" w:color="000000" w:sz="4"/>
-            </w:tcBorders>
-            <w:tcMar>
-              <w:top w:type="dxa" w:w="30"/>
-              <w:left w:type="dxa" w:w="70"/>
-              <w:bottom w:type="dxa" w:w="30"/>
-              <w:right w:type="dxa" w:w="70"/>
-            </w:tcMar>
-            <w:vAlign w:val="center"/>
-          </w:tcPr>
-          <w:p>
-            <w:pPr>
+            <w:tcW w:type="dxa" w:w="2796"/>
+            <w:tcBorders>
+              <w:top w:val="single" w:color="000000" w:sz="4"/>
+              <w:left w:val="single" w:color="000000" w:sz="4"/>
+              <w:bottom w:val="single" w:color="000000" w:sz="4"/>
+              <w:right w:val="single" w:color="000000" w:sz="4"/>
+            </w:tcBorders>
+            <w:tcMar>
+              <w:top w:type="dxa" w:w="30"/>
+              <w:left w:type="dxa" w:w="70"/>
+              <w:bottom w:type="dxa" w:w="30"/>
+              <w:right w:type="dxa" w:w="70"/>
+            </w:tcMar>
+            <w:vAlign w:val="center"/>
+          </w:tcPr>
+          <w:p>
+            <w:pPr>
+              <w:keepNext w:val="false"/>
               <w:spacing w:after="0" w:before="0" w:line="240" w:lineRule="auto"/>
               <w:jc w:val="left"/>
             </w:pPr>
@@ -2346,47 +2395,49 @@
         </w:tc>
         <w:tc>
           <w:tcPr>
-            <w:tcW w:type="dxa" w:w="2161"/>
-            <w:tcBorders>
-              <w:top w:val="single" w:color="000000" w:sz="4"/>
-              <w:left w:val="single" w:color="000000" w:sz="4"/>
-              <w:bottom w:val="single" w:color="000000" w:sz="4"/>
-              <w:right w:val="single" w:color="000000" w:sz="4"/>
-            </w:tcBorders>
-            <w:tcMar>
-              <w:top w:type="dxa" w:w="30"/>
-              <w:left w:type="dxa" w:w="70"/>
-              <w:bottom w:type="dxa" w:w="30"/>
-              <w:right w:type="dxa" w:w="70"/>
-            </w:tcMar>
-            <w:vAlign w:val="center"/>
-          </w:tcPr>
-          <w:p>
-            <w:pPr>
-              <w:spacing w:after="0" w:before="0" w:line="240" w:lineRule="auto"/>
-              <w:jc w:val="left"/>
-            </w:pPr>
-          </w:p>
-        </w:tc>
-        <w:tc>
-          <w:tcPr>
-            <w:tcW w:type="dxa" w:w="4558"/>
-            <w:tcBorders>
-              <w:top w:val="single" w:color="000000" w:sz="4"/>
-              <w:left w:val="single" w:color="000000" w:sz="4"/>
-              <w:bottom w:val="single" w:color="000000" w:sz="4"/>
-              <w:right w:val="single" w:color="000000" w:sz="4"/>
-            </w:tcBorders>
-            <w:tcMar>
-              <w:top w:type="dxa" w:w="30"/>
-              <w:left w:type="dxa" w:w="70"/>
-              <w:bottom w:type="dxa" w:w="30"/>
-              <w:right w:type="dxa" w:w="70"/>
-            </w:tcMar>
-            <w:vAlign w:val="center"/>
-          </w:tcPr>
-          <w:p>
-            <w:pPr>
+            <w:tcW w:type="dxa" w:w="1830"/>
+            <w:tcBorders>
+              <w:top w:val="single" w:color="000000" w:sz="4"/>
+              <w:left w:val="single" w:color="000000" w:sz="4"/>
+              <w:bottom w:val="single" w:color="000000" w:sz="4"/>
+              <w:right w:val="single" w:color="000000" w:sz="4"/>
+            </w:tcBorders>
+            <w:tcMar>
+              <w:top w:type="dxa" w:w="30"/>
+              <w:left w:type="dxa" w:w="70"/>
+              <w:bottom w:type="dxa" w:w="30"/>
+              <w:right w:type="dxa" w:w="70"/>
+            </w:tcMar>
+            <w:vAlign w:val="center"/>
+          </w:tcPr>
+          <w:p>
+            <w:pPr>
+              <w:keepNext w:val="false"/>
+              <w:spacing w:after="0" w:before="0" w:line="240" w:lineRule="auto"/>
+              <w:jc w:val="left"/>
+            </w:pPr>
+          </w:p>
+        </w:tc>
+        <w:tc>
+          <w:tcPr>
+            <w:tcW w:type="dxa" w:w="4399"/>
+            <w:tcBorders>
+              <w:top w:val="single" w:color="000000" w:sz="4"/>
+              <w:left w:val="single" w:color="000000" w:sz="4"/>
+              <w:bottom w:val="single" w:color="000000" w:sz="4"/>
+              <w:right w:val="single" w:color="000000" w:sz="4"/>
+            </w:tcBorders>
+            <w:tcMar>
+              <w:top w:type="dxa" w:w="30"/>
+              <w:left w:type="dxa" w:w="70"/>
+              <w:bottom w:type="dxa" w:w="30"/>
+              <w:right w:type="dxa" w:w="70"/>
+            </w:tcMar>
+            <w:vAlign w:val="center"/>
+          </w:tcPr>
+          <w:p>
+            <w:pPr>
+              <w:keepNext w:val="false"/>
               <w:spacing w:after="0" w:before="0" w:line="240" w:lineRule="auto"/>
               <w:jc w:val="left"/>
             </w:pPr>
@@ -2445,10 +2496,10 @@
         <w:tblLayout w:type="autofit"/>
       </w:tblPr>
       <w:tblGrid>
-        <w:gridCol w:w="5403"/>
-        <w:gridCol w:w="1081"/>
-        <w:gridCol w:w="1081"/>
-        <w:gridCol w:w="1460"/>
+        <w:gridCol w:w="4854"/>
+        <w:gridCol w:w="1572"/>
+        <w:gridCol w:w="987"/>
+        <w:gridCol w:w="1612"/>
       </w:tblGrid>
       <w:tr>
         <w:trPr>
@@ -2457,7 +2508,7 @@
         </w:trPr>
         <w:tc>
           <w:tcPr>
-            <w:tcW w:type="dxa" w:w="5403"/>
+            <w:tcW w:type="dxa" w:w="4854"/>
             <w:tcBorders>
               <w:top w:val="single" w:color="000000" w:sz="4"/>
               <w:left w:val="single" w:color="000000" w:sz="4"/>
@@ -2475,6 +2526,7 @@
           </w:tcPr>
           <w:p>
             <w:pPr>
+              <w:keepNext/>
               <w:spacing w:after="0" w:before="0" w:line="240" w:lineRule="auto"/>
               <w:jc w:val="center"/>
             </w:pPr>
@@ -2494,7 +2546,7 @@
         </w:tc>
         <w:tc>
           <w:tcPr>
-            <w:tcW w:type="dxa" w:w="1081"/>
+            <w:tcW w:type="dxa" w:w="1572"/>
             <w:tcBorders>
               <w:top w:val="single" w:color="000000" w:sz="4"/>
               <w:left w:val="single" w:color="000000" w:sz="4"/>
@@ -2512,6 +2564,7 @@
           </w:tcPr>
           <w:p>
             <w:pPr>
+              <w:keepNext/>
               <w:spacing w:after="0" w:before="0" w:line="240" w:lineRule="auto"/>
               <w:jc w:val="center"/>
             </w:pPr>
@@ -2531,7 +2584,7 @@
         </w:tc>
         <w:tc>
           <w:tcPr>
-            <w:tcW w:type="dxa" w:w="1081"/>
+            <w:tcW w:type="dxa" w:w="987"/>
             <w:tcBorders>
               <w:top w:val="single" w:color="000000" w:sz="4"/>
               <w:left w:val="single" w:color="000000" w:sz="4"/>
@@ -2549,6 +2602,7 @@
           </w:tcPr>
           <w:p>
             <w:pPr>
+              <w:keepNext/>
               <w:spacing w:after="0" w:before="0" w:line="240" w:lineRule="auto"/>
               <w:jc w:val="center"/>
             </w:pPr>
@@ -2568,7 +2622,7 @@
         </w:tc>
         <w:tc>
           <w:tcPr>
-            <w:tcW w:type="dxa" w:w="1460"/>
+            <w:tcW w:type="dxa" w:w="1612"/>
             <w:tcBorders>
               <w:top w:val="single" w:color="000000" w:sz="4"/>
               <w:left w:val="single" w:color="000000" w:sz="4"/>
@@ -2586,6 +2640,7 @@
           </w:tcPr>
           <w:p>
             <w:pPr>
+              <w:keepNext/>
               <w:spacing w:after="0" w:before="0" w:line="240" w:lineRule="auto"/>
               <w:jc w:val="center"/>
             </w:pPr>
@@ -2611,23 +2666,24 @@
         </w:trPr>
         <w:tc>
           <w:tcPr>
-            <w:tcW w:type="dxa" w:w="5403"/>
-            <w:tcBorders>
-              <w:top w:val="single" w:color="000000" w:sz="4"/>
-              <w:left w:val="single" w:color="000000" w:sz="4"/>
-              <w:bottom w:val="single" w:color="000000" w:sz="4"/>
-              <w:right w:val="single" w:color="000000" w:sz="4"/>
-            </w:tcBorders>
-            <w:tcMar>
-              <w:top w:type="dxa" w:w="30"/>
-              <w:left w:type="dxa" w:w="70"/>
-              <w:bottom w:type="dxa" w:w="30"/>
-              <w:right w:type="dxa" w:w="70"/>
-            </w:tcMar>
-            <w:vAlign w:val="center"/>
-          </w:tcPr>
-          <w:p>
-            <w:pPr>
+            <w:tcW w:type="dxa" w:w="4854"/>
+            <w:tcBorders>
+              <w:top w:val="single" w:color="000000" w:sz="4"/>
+              <w:left w:val="single" w:color="000000" w:sz="4"/>
+              <w:bottom w:val="single" w:color="000000" w:sz="4"/>
+              <w:right w:val="single" w:color="000000" w:sz="4"/>
+            </w:tcBorders>
+            <w:tcMar>
+              <w:top w:type="dxa" w:w="30"/>
+              <w:left w:type="dxa" w:w="70"/>
+              <w:bottom w:type="dxa" w:w="30"/>
+              <w:right w:type="dxa" w:w="70"/>
+            </w:tcMar>
+            <w:vAlign w:val="center"/>
+          </w:tcPr>
+          <w:p>
+            <w:pPr>
+              <w:keepNext w:val="false"/>
               <w:spacing w:after="0" w:before="0" w:line="240" w:lineRule="auto"/>
               <w:jc w:val="left"/>
             </w:pPr>
@@ -2648,71 +2704,74 @@
         </w:tc>
         <w:tc>
           <w:tcPr>
-            <w:tcW w:type="dxa" w:w="1081"/>
-            <w:tcBorders>
-              <w:top w:val="single" w:color="000000" w:sz="4"/>
-              <w:left w:val="single" w:color="000000" w:sz="4"/>
-              <w:bottom w:val="single" w:color="000000" w:sz="4"/>
-              <w:right w:val="single" w:color="000000" w:sz="4"/>
-            </w:tcBorders>
-            <w:tcMar>
-              <w:top w:type="dxa" w:w="30"/>
-              <w:left w:type="dxa" w:w="70"/>
-              <w:bottom w:type="dxa" w:w="30"/>
-              <w:right w:type="dxa" w:w="70"/>
-            </w:tcMar>
-            <w:vAlign w:val="center"/>
-          </w:tcPr>
-          <w:p>
-            <w:pPr>
-              <w:spacing w:after="0" w:before="0" w:line="240" w:lineRule="auto"/>
-              <w:jc w:val="left"/>
-            </w:pPr>
-          </w:p>
-        </w:tc>
-        <w:tc>
-          <w:tcPr>
-            <w:tcW w:type="dxa" w:w="1081"/>
-            <w:tcBorders>
-              <w:top w:val="single" w:color="000000" w:sz="4"/>
-              <w:left w:val="single" w:color="000000" w:sz="4"/>
-              <w:bottom w:val="single" w:color="000000" w:sz="4"/>
-              <w:right w:val="single" w:color="000000" w:sz="4"/>
-            </w:tcBorders>
-            <w:tcMar>
-              <w:top w:type="dxa" w:w="30"/>
-              <w:left w:type="dxa" w:w="70"/>
-              <w:bottom w:type="dxa" w:w="30"/>
-              <w:right w:type="dxa" w:w="70"/>
-            </w:tcMar>
-            <w:vAlign w:val="center"/>
-          </w:tcPr>
-          <w:p>
-            <w:pPr>
-              <w:spacing w:after="0" w:before="0" w:line="240" w:lineRule="auto"/>
-              <w:jc w:val="left"/>
-            </w:pPr>
-          </w:p>
-        </w:tc>
-        <w:tc>
-          <w:tcPr>
-            <w:tcW w:type="dxa" w:w="1460"/>
-            <w:tcBorders>
-              <w:top w:val="single" w:color="000000" w:sz="4"/>
-              <w:left w:val="single" w:color="000000" w:sz="4"/>
-              <w:bottom w:val="single" w:color="000000" w:sz="4"/>
-              <w:right w:val="single" w:color="000000" w:sz="4"/>
-            </w:tcBorders>
-            <w:tcMar>
-              <w:top w:type="dxa" w:w="30"/>
-              <w:left w:type="dxa" w:w="70"/>
-              <w:bottom w:type="dxa" w:w="30"/>
-              <w:right w:type="dxa" w:w="70"/>
-            </w:tcMar>
-            <w:vAlign w:val="center"/>
-          </w:tcPr>
-          <w:p>
-            <w:pPr>
+            <w:tcW w:type="dxa" w:w="1572"/>
+            <w:tcBorders>
+              <w:top w:val="single" w:color="000000" w:sz="4"/>
+              <w:left w:val="single" w:color="000000" w:sz="4"/>
+              <w:bottom w:val="single" w:color="000000" w:sz="4"/>
+              <w:right w:val="single" w:color="000000" w:sz="4"/>
+            </w:tcBorders>
+            <w:tcMar>
+              <w:top w:type="dxa" w:w="30"/>
+              <w:left w:type="dxa" w:w="70"/>
+              <w:bottom w:type="dxa" w:w="30"/>
+              <w:right w:type="dxa" w:w="70"/>
+            </w:tcMar>
+            <w:vAlign w:val="center"/>
+          </w:tcPr>
+          <w:p>
+            <w:pPr>
+              <w:keepNext w:val="false"/>
+              <w:spacing w:after="0" w:before="0" w:line="240" w:lineRule="auto"/>
+              <w:jc w:val="left"/>
+            </w:pPr>
+          </w:p>
+        </w:tc>
+        <w:tc>
+          <w:tcPr>
+            <w:tcW w:type="dxa" w:w="987"/>
+            <w:tcBorders>
+              <w:top w:val="single" w:color="000000" w:sz="4"/>
+              <w:left w:val="single" w:color="000000" w:sz="4"/>
+              <w:bottom w:val="single" w:color="000000" w:sz="4"/>
+              <w:right w:val="single" w:color="000000" w:sz="4"/>
+            </w:tcBorders>
+            <w:tcMar>
+              <w:top w:type="dxa" w:w="30"/>
+              <w:left w:type="dxa" w:w="70"/>
+              <w:bottom w:type="dxa" w:w="30"/>
+              <w:right w:type="dxa" w:w="70"/>
+            </w:tcMar>
+            <w:vAlign w:val="center"/>
+          </w:tcPr>
+          <w:p>
+            <w:pPr>
+              <w:keepNext w:val="false"/>
+              <w:spacing w:after="0" w:before="0" w:line="240" w:lineRule="auto"/>
+              <w:jc w:val="left"/>
+            </w:pPr>
+          </w:p>
+        </w:tc>
+        <w:tc>
+          <w:tcPr>
+            <w:tcW w:type="dxa" w:w="1612"/>
+            <w:tcBorders>
+              <w:top w:val="single" w:color="000000" w:sz="4"/>
+              <w:left w:val="single" w:color="000000" w:sz="4"/>
+              <w:bottom w:val="single" w:color="000000" w:sz="4"/>
+              <w:right w:val="single" w:color="000000" w:sz="4"/>
+            </w:tcBorders>
+            <w:tcMar>
+              <w:top w:type="dxa" w:w="30"/>
+              <w:left w:type="dxa" w:w="70"/>
+              <w:bottom w:type="dxa" w:w="30"/>
+              <w:right w:type="dxa" w:w="70"/>
+            </w:tcMar>
+            <w:vAlign w:val="center"/>
+          </w:tcPr>
+          <w:p>
+            <w:pPr>
+              <w:keepNext w:val="false"/>
               <w:spacing w:after="0" w:before="0" w:line="240" w:lineRule="auto"/>
               <w:jc w:val="left"/>
             </w:pPr>
@@ -2804,9 +2863,9 @@
         <w:tblLayout w:type="autofit"/>
       </w:tblPr>
       <w:tblGrid>
-        <w:gridCol w:w="4212"/>
+        <w:gridCol w:w="3897"/>
         <w:gridCol w:w="715"/>
-        <w:gridCol w:w="4098"/>
+        <w:gridCol w:w="4413"/>
       </w:tblGrid>
       <w:tr>
         <w:trPr>
@@ -2815,7 +2874,7 @@
         </w:trPr>
         <w:tc>
           <w:tcPr>
-            <w:tcW w:type="dxa" w:w="4212"/>
+            <w:tcW w:type="dxa" w:w="3897"/>
             <w:tcBorders>
               <w:top w:val="single" w:color="000000" w:sz="4"/>
               <w:left w:val="single" w:color="000000" w:sz="4"/>
@@ -2833,6 +2892,7 @@
           </w:tcPr>
           <w:p>
             <w:pPr>
+              <w:keepNext/>
               <w:spacing w:after="0" w:before="0" w:line="240" w:lineRule="auto"/>
               <w:jc w:val="center"/>
             </w:pPr>
@@ -2870,6 +2930,7 @@
           </w:tcPr>
           <w:p>
             <w:pPr>
+              <w:keepNext/>
               <w:spacing w:after="0" w:before="0" w:line="240" w:lineRule="auto"/>
               <w:jc w:val="center"/>
             </w:pPr>
@@ -2889,7 +2950,7 @@
         </w:tc>
         <w:tc>
           <w:tcPr>
-            <w:tcW w:type="dxa" w:w="4098"/>
+            <w:tcW w:type="dxa" w:w="4413"/>
             <w:tcBorders>
               <w:top w:val="single" w:color="000000" w:sz="4"/>
               <w:left w:val="single" w:color="000000" w:sz="4"/>
@@ -2907,6 +2968,7 @@
           </w:tcPr>
           <w:p>
             <w:pPr>
+              <w:keepNext/>
               <w:spacing w:after="0" w:before="0" w:line="240" w:lineRule="auto"/>
               <w:jc w:val="center"/>
             </w:pPr>
@@ -2932,23 +2994,24 @@
         </w:trPr>
         <w:tc>
           <w:tcPr>
-            <w:tcW w:type="dxa" w:w="4212"/>
-            <w:tcBorders>
-              <w:top w:val="single" w:color="000000" w:sz="4"/>
-              <w:left w:val="single" w:color="000000" w:sz="4"/>
-              <w:bottom w:val="single" w:color="000000" w:sz="4"/>
-              <w:right w:val="single" w:color="000000" w:sz="4"/>
-            </w:tcBorders>
-            <w:tcMar>
-              <w:top w:type="dxa" w:w="30"/>
-              <w:left w:type="dxa" w:w="70"/>
-              <w:bottom w:type="dxa" w:w="30"/>
-              <w:right w:type="dxa" w:w="70"/>
-            </w:tcMar>
-            <w:vAlign w:val="center"/>
-          </w:tcPr>
-          <w:p>
-            <w:pPr>
+            <w:tcW w:type="dxa" w:w="3897"/>
+            <w:tcBorders>
+              <w:top w:val="single" w:color="000000" w:sz="4"/>
+              <w:left w:val="single" w:color="000000" w:sz="4"/>
+              <w:bottom w:val="single" w:color="000000" w:sz="4"/>
+              <w:right w:val="single" w:color="000000" w:sz="4"/>
+            </w:tcBorders>
+            <w:tcMar>
+              <w:top w:type="dxa" w:w="30"/>
+              <w:left w:type="dxa" w:w="70"/>
+              <w:bottom w:type="dxa" w:w="30"/>
+              <w:right w:type="dxa" w:w="70"/>
+            </w:tcMar>
+            <w:vAlign w:val="center"/>
+          </w:tcPr>
+          <w:p>
+            <w:pPr>
+              <w:keepNext/>
               <w:spacing w:after="0" w:before="0" w:line="240" w:lineRule="auto"/>
               <w:jc w:val="left"/>
             </w:pPr>
@@ -2985,6 +3048,7 @@
           </w:tcPr>
           <w:p>
             <w:pPr>
+              <w:keepNext/>
               <w:spacing w:after="0" w:before="0" w:line="240" w:lineRule="auto"/>
               <w:jc w:val="left"/>
             </w:pPr>
@@ -3004,23 +3068,24 @@
         </w:tc>
         <w:tc>
           <w:tcPr>
-            <w:tcW w:type="dxa" w:w="4098"/>
-            <w:tcBorders>
-              <w:top w:val="single" w:color="000000" w:sz="4"/>
-              <w:left w:val="single" w:color="000000" w:sz="4"/>
-              <w:bottom w:val="single" w:color="000000" w:sz="4"/>
-              <w:right w:val="single" w:color="000000" w:sz="4"/>
-            </w:tcBorders>
-            <w:tcMar>
-              <w:top w:type="dxa" w:w="30"/>
-              <w:left w:type="dxa" w:w="70"/>
-              <w:bottom w:type="dxa" w:w="30"/>
-              <w:right w:type="dxa" w:w="70"/>
-            </w:tcMar>
-            <w:vAlign w:val="center"/>
-          </w:tcPr>
-          <w:p>
-            <w:pPr>
+            <w:tcW w:type="dxa" w:w="4413"/>
+            <w:tcBorders>
+              <w:top w:val="single" w:color="000000" w:sz="4"/>
+              <w:left w:val="single" w:color="000000" w:sz="4"/>
+              <w:bottom w:val="single" w:color="000000" w:sz="4"/>
+              <w:right w:val="single" w:color="000000" w:sz="4"/>
+            </w:tcBorders>
+            <w:tcMar>
+              <w:top w:type="dxa" w:w="30"/>
+              <w:left w:type="dxa" w:w="70"/>
+              <w:bottom w:type="dxa" w:w="30"/>
+              <w:right w:type="dxa" w:w="70"/>
+            </w:tcMar>
+            <w:vAlign w:val="center"/>
+          </w:tcPr>
+          <w:p>
+            <w:pPr>
+              <w:keepNext/>
               <w:spacing w:after="0" w:before="0" w:line="240" w:lineRule="auto"/>
               <w:jc w:val="left"/>
             </w:pPr>
@@ -3034,23 +3099,24 @@
         </w:trPr>
         <w:tc>
           <w:tcPr>
-            <w:tcW w:type="dxa" w:w="4212"/>
-            <w:tcBorders>
-              <w:top w:val="single" w:color="000000" w:sz="4"/>
-              <w:left w:val="single" w:color="000000" w:sz="4"/>
-              <w:bottom w:val="single" w:color="000000" w:sz="4"/>
-              <w:right w:val="single" w:color="000000" w:sz="4"/>
-            </w:tcBorders>
-            <w:tcMar>
-              <w:top w:type="dxa" w:w="30"/>
-              <w:left w:type="dxa" w:w="70"/>
-              <w:bottom w:type="dxa" w:w="30"/>
-              <w:right w:type="dxa" w:w="70"/>
-            </w:tcMar>
-            <w:vAlign w:val="center"/>
-          </w:tcPr>
-          <w:p>
-            <w:pPr>
+            <w:tcW w:type="dxa" w:w="3897"/>
+            <w:tcBorders>
+              <w:top w:val="single" w:color="000000" w:sz="4"/>
+              <w:left w:val="single" w:color="000000" w:sz="4"/>
+              <w:bottom w:val="single" w:color="000000" w:sz="4"/>
+              <w:right w:val="single" w:color="000000" w:sz="4"/>
+            </w:tcBorders>
+            <w:tcMar>
+              <w:top w:type="dxa" w:w="30"/>
+              <w:left w:type="dxa" w:w="70"/>
+              <w:bottom w:type="dxa" w:w="30"/>
+              <w:right w:type="dxa" w:w="70"/>
+            </w:tcMar>
+            <w:vAlign w:val="center"/>
+          </w:tcPr>
+          <w:p>
+            <w:pPr>
+              <w:keepNext/>
               <w:spacing w:after="0" w:before="0" w:line="240" w:lineRule="auto"/>
               <w:jc w:val="left"/>
             </w:pPr>
@@ -3087,6 +3153,7 @@
           </w:tcPr>
           <w:p>
             <w:pPr>
+              <w:keepNext/>
               <w:spacing w:after="0" w:before="0" w:line="240" w:lineRule="auto"/>
               <w:jc w:val="left"/>
             </w:pPr>
@@ -3106,23 +3173,24 @@
         </w:tc>
         <w:tc>
           <w:tcPr>
-            <w:tcW w:type="dxa" w:w="4098"/>
-            <w:tcBorders>
-              <w:top w:val="single" w:color="000000" w:sz="4"/>
-              <w:left w:val="single" w:color="000000" w:sz="4"/>
-              <w:bottom w:val="single" w:color="000000" w:sz="4"/>
-              <w:right w:val="single" w:color="000000" w:sz="4"/>
-            </w:tcBorders>
-            <w:tcMar>
-              <w:top w:type="dxa" w:w="30"/>
-              <w:left w:type="dxa" w:w="70"/>
-              <w:bottom w:type="dxa" w:w="30"/>
-              <w:right w:type="dxa" w:w="70"/>
-            </w:tcMar>
-            <w:vAlign w:val="center"/>
-          </w:tcPr>
-          <w:p>
-            <w:pPr>
+            <w:tcW w:type="dxa" w:w="4413"/>
+            <w:tcBorders>
+              <w:top w:val="single" w:color="000000" w:sz="4"/>
+              <w:left w:val="single" w:color="000000" w:sz="4"/>
+              <w:bottom w:val="single" w:color="000000" w:sz="4"/>
+              <w:right w:val="single" w:color="000000" w:sz="4"/>
+            </w:tcBorders>
+            <w:tcMar>
+              <w:top w:type="dxa" w:w="30"/>
+              <w:left w:type="dxa" w:w="70"/>
+              <w:bottom w:type="dxa" w:w="30"/>
+              <w:right w:type="dxa" w:w="70"/>
+            </w:tcMar>
+            <w:vAlign w:val="center"/>
+          </w:tcPr>
+          <w:p>
+            <w:pPr>
+              <w:keepNext/>
               <w:spacing w:after="0" w:before="0" w:line="240" w:lineRule="auto"/>
               <w:jc w:val="left"/>
             </w:pPr>
@@ -3136,23 +3204,24 @@
         </w:trPr>
         <w:tc>
           <w:tcPr>
-            <w:tcW w:type="dxa" w:w="4212"/>
-            <w:tcBorders>
-              <w:top w:val="single" w:color="000000" w:sz="4"/>
-              <w:left w:val="single" w:color="000000" w:sz="4"/>
-              <w:bottom w:val="single" w:color="000000" w:sz="4"/>
-              <w:right w:val="single" w:color="000000" w:sz="4"/>
-            </w:tcBorders>
-            <w:tcMar>
-              <w:top w:type="dxa" w:w="30"/>
-              <w:left w:type="dxa" w:w="70"/>
-              <w:bottom w:type="dxa" w:w="30"/>
-              <w:right w:type="dxa" w:w="70"/>
-            </w:tcMar>
-            <w:vAlign w:val="center"/>
-          </w:tcPr>
-          <w:p>
-            <w:pPr>
+            <w:tcW w:type="dxa" w:w="3897"/>
+            <w:tcBorders>
+              <w:top w:val="single" w:color="000000" w:sz="4"/>
+              <w:left w:val="single" w:color="000000" w:sz="4"/>
+              <w:bottom w:val="single" w:color="000000" w:sz="4"/>
+              <w:right w:val="single" w:color="000000" w:sz="4"/>
+            </w:tcBorders>
+            <w:tcMar>
+              <w:top w:type="dxa" w:w="30"/>
+              <w:left w:type="dxa" w:w="70"/>
+              <w:bottom w:type="dxa" w:w="30"/>
+              <w:right w:type="dxa" w:w="70"/>
+            </w:tcMar>
+            <w:vAlign w:val="center"/>
+          </w:tcPr>
+          <w:p>
+            <w:pPr>
+              <w:keepNext/>
               <w:spacing w:after="0" w:before="0" w:line="240" w:lineRule="auto"/>
               <w:jc w:val="left"/>
             </w:pPr>
@@ -3189,6 +3258,7 @@
           </w:tcPr>
           <w:p>
             <w:pPr>
+              <w:keepNext/>
               <w:spacing w:after="0" w:before="0" w:line="240" w:lineRule="auto"/>
               <w:jc w:val="left"/>
             </w:pPr>
@@ -3208,23 +3278,24 @@
         </w:tc>
         <w:tc>
           <w:tcPr>
-            <w:tcW w:type="dxa" w:w="4098"/>
-            <w:tcBorders>
-              <w:top w:val="single" w:color="000000" w:sz="4"/>
-              <w:left w:val="single" w:color="000000" w:sz="4"/>
-              <w:bottom w:val="single" w:color="000000" w:sz="4"/>
-              <w:right w:val="single" w:color="000000" w:sz="4"/>
-            </w:tcBorders>
-            <w:tcMar>
-              <w:top w:type="dxa" w:w="30"/>
-              <w:left w:type="dxa" w:w="70"/>
-              <w:bottom w:type="dxa" w:w="30"/>
-              <w:right w:type="dxa" w:w="70"/>
-            </w:tcMar>
-            <w:vAlign w:val="center"/>
-          </w:tcPr>
-          <w:p>
-            <w:pPr>
+            <w:tcW w:type="dxa" w:w="4413"/>
+            <w:tcBorders>
+              <w:top w:val="single" w:color="000000" w:sz="4"/>
+              <w:left w:val="single" w:color="000000" w:sz="4"/>
+              <w:bottom w:val="single" w:color="000000" w:sz="4"/>
+              <w:right w:val="single" w:color="000000" w:sz="4"/>
+            </w:tcBorders>
+            <w:tcMar>
+              <w:top w:type="dxa" w:w="30"/>
+              <w:left w:type="dxa" w:w="70"/>
+              <w:bottom w:type="dxa" w:w="30"/>
+              <w:right w:type="dxa" w:w="70"/>
+            </w:tcMar>
+            <w:vAlign w:val="center"/>
+          </w:tcPr>
+          <w:p>
+            <w:pPr>
+              <w:keepNext/>
               <w:spacing w:after="0" w:before="0" w:line="240" w:lineRule="auto"/>
               <w:jc w:val="left"/>
             </w:pPr>
@@ -3238,23 +3309,24 @@
         </w:trPr>
         <w:tc>
           <w:tcPr>
-            <w:tcW w:type="dxa" w:w="4212"/>
-            <w:tcBorders>
-              <w:top w:val="single" w:color="000000" w:sz="4"/>
-              <w:left w:val="single" w:color="000000" w:sz="4"/>
-              <w:bottom w:val="single" w:color="000000" w:sz="4"/>
-              <w:right w:val="single" w:color="000000" w:sz="4"/>
-            </w:tcBorders>
-            <w:tcMar>
-              <w:top w:type="dxa" w:w="30"/>
-              <w:left w:type="dxa" w:w="70"/>
-              <w:bottom w:type="dxa" w:w="30"/>
-              <w:right w:type="dxa" w:w="70"/>
-            </w:tcMar>
-            <w:vAlign w:val="center"/>
-          </w:tcPr>
-          <w:p>
-            <w:pPr>
+            <w:tcW w:type="dxa" w:w="3897"/>
+            <w:tcBorders>
+              <w:top w:val="single" w:color="000000" w:sz="4"/>
+              <w:left w:val="single" w:color="000000" w:sz="4"/>
+              <w:bottom w:val="single" w:color="000000" w:sz="4"/>
+              <w:right w:val="single" w:color="000000" w:sz="4"/>
+            </w:tcBorders>
+            <w:tcMar>
+              <w:top w:type="dxa" w:w="30"/>
+              <w:left w:type="dxa" w:w="70"/>
+              <w:bottom w:type="dxa" w:w="30"/>
+              <w:right w:type="dxa" w:w="70"/>
+            </w:tcMar>
+            <w:vAlign w:val="center"/>
+          </w:tcPr>
+          <w:p>
+            <w:pPr>
+              <w:keepNext w:val="false"/>
               <w:spacing w:after="0" w:before="0" w:line="240" w:lineRule="auto"/>
               <w:jc w:val="left"/>
             </w:pPr>
@@ -3291,6 +3363,7 @@
           </w:tcPr>
           <w:p>
             <w:pPr>
+              <w:keepNext w:val="false"/>
               <w:spacing w:after="0" w:before="0" w:line="240" w:lineRule="auto"/>
               <w:jc w:val="left"/>
             </w:pPr>
@@ -3310,23 +3383,24 @@
         </w:tc>
         <w:tc>
           <w:tcPr>
-            <w:tcW w:type="dxa" w:w="4098"/>
-            <w:tcBorders>
-              <w:top w:val="single" w:color="000000" w:sz="4"/>
-              <w:left w:val="single" w:color="000000" w:sz="4"/>
-              <w:bottom w:val="single" w:color="000000" w:sz="4"/>
-              <w:right w:val="single" w:color="000000" w:sz="4"/>
-            </w:tcBorders>
-            <w:tcMar>
-              <w:top w:type="dxa" w:w="30"/>
-              <w:left w:type="dxa" w:w="70"/>
-              <w:bottom w:type="dxa" w:w="30"/>
-              <w:right w:type="dxa" w:w="70"/>
-            </w:tcMar>
-            <w:vAlign w:val="center"/>
-          </w:tcPr>
-          <w:p>
-            <w:pPr>
+            <w:tcW w:type="dxa" w:w="4413"/>
+            <w:tcBorders>
+              <w:top w:val="single" w:color="000000" w:sz="4"/>
+              <w:left w:val="single" w:color="000000" w:sz="4"/>
+              <w:bottom w:val="single" w:color="000000" w:sz="4"/>
+              <w:right w:val="single" w:color="000000" w:sz="4"/>
+            </w:tcBorders>
+            <w:tcMar>
+              <w:top w:type="dxa" w:w="30"/>
+              <w:left w:type="dxa" w:w="70"/>
+              <w:bottom w:type="dxa" w:w="30"/>
+              <w:right w:type="dxa" w:w="70"/>
+            </w:tcMar>
+            <w:vAlign w:val="center"/>
+          </w:tcPr>
+          <w:p>
+            <w:pPr>
+              <w:keepNext w:val="false"/>
               <w:spacing w:after="0" w:before="0" w:line="240" w:lineRule="auto"/>
               <w:jc w:val="left"/>
             </w:pPr>
@@ -3415,6 +3489,7 @@
           </w:tcPr>
           <w:p>
             <w:pPr>
+              <w:keepNext/>
               <w:spacing w:after="0" w:before="0" w:line="240" w:lineRule="auto"/>
               <w:jc w:val="center"/>
             </w:pPr>
@@ -3452,6 +3527,7 @@
           </w:tcPr>
           <w:p>
             <w:pPr>
+              <w:keepNext/>
               <w:spacing w:after="0" w:before="0" w:line="240" w:lineRule="auto"/>
               <w:jc w:val="center"/>
             </w:pPr>
@@ -3489,6 +3565,7 @@
           </w:tcPr>
           <w:p>
             <w:pPr>
+              <w:keepNext/>
               <w:spacing w:after="0" w:before="0" w:line="240" w:lineRule="auto"/>
               <w:jc w:val="center"/>
             </w:pPr>
@@ -3531,6 +3608,7 @@
           </w:tcPr>
           <w:p>
             <w:pPr>
+              <w:keepNext/>
               <w:spacing w:after="0" w:before="0" w:line="240" w:lineRule="auto"/>
               <w:jc w:val="left"/>
             </w:pPr>
@@ -3567,6 +3645,7 @@
           </w:tcPr>
           <w:p>
             <w:pPr>
+              <w:keepNext/>
               <w:spacing w:after="0" w:before="0" w:line="240" w:lineRule="auto"/>
               <w:jc w:val="left"/>
             </w:pPr>
@@ -3603,6 +3682,7 @@
           </w:tcPr>
           <w:p>
             <w:pPr>
+              <w:keepNext/>
               <w:spacing w:after="0" w:before="0" w:line="240" w:lineRule="auto"/>
               <w:jc w:val="left"/>
             </w:pPr>
@@ -3633,6 +3713,7 @@
           </w:tcPr>
           <w:p>
             <w:pPr>
+              <w:keepNext/>
               <w:spacing w:after="0" w:before="0" w:line="240" w:lineRule="auto"/>
               <w:jc w:val="left"/>
             </w:pPr>
@@ -3669,6 +3750,7 @@
           </w:tcPr>
           <w:p>
             <w:pPr>
+              <w:keepNext/>
               <w:spacing w:after="0" w:before="0" w:line="240" w:lineRule="auto"/>
               <w:jc w:val="left"/>
             </w:pPr>
@@ -3705,6 +3787,7 @@
           </w:tcPr>
           <w:p>
             <w:pPr>
+              <w:keepNext/>
               <w:spacing w:after="0" w:before="0" w:line="240" w:lineRule="auto"/>
               <w:jc w:val="left"/>
             </w:pPr>
@@ -3772,6 +3855,7 @@
           </w:tcPr>
           <w:p>
             <w:pPr>
+              <w:keepNext/>
               <w:spacing w:after="0" w:before="0" w:line="240" w:lineRule="auto"/>
               <w:jc w:val="left"/>
             </w:pPr>
@@ -3808,6 +3892,7 @@
           </w:tcPr>
           <w:p>
             <w:pPr>
+              <w:keepNext/>
               <w:spacing w:after="0" w:before="0" w:line="240" w:lineRule="auto"/>
               <w:jc w:val="left"/>
             </w:pPr>
@@ -3844,6 +3929,7 @@
           </w:tcPr>
           <w:p>
             <w:pPr>
+              <w:keepNext/>
               <w:spacing w:after="0" w:before="0" w:line="240" w:lineRule="auto"/>
               <w:jc w:val="left"/>
             </w:pPr>
@@ -3886,6 +3972,7 @@
           </w:tcPr>
           <w:p>
             <w:pPr>
+              <w:keepNext/>
               <w:spacing w:after="0" w:before="0" w:line="240" w:lineRule="auto"/>
               <w:jc w:val="left"/>
             </w:pPr>
@@ -3922,6 +4009,7 @@
           </w:tcPr>
           <w:p>
             <w:pPr>
+              <w:keepNext/>
               <w:spacing w:after="0" w:before="0" w:line="240" w:lineRule="auto"/>
               <w:jc w:val="left"/>
             </w:pPr>
@@ -3958,6 +4046,7 @@
           </w:tcPr>
           <w:p>
             <w:pPr>
+              <w:keepNext/>
               <w:spacing w:after="0" w:before="0" w:line="240" w:lineRule="auto"/>
               <w:jc w:val="left"/>
             </w:pPr>
@@ -4013,6 +4102,7 @@
           </w:tcPr>
           <w:p>
             <w:pPr>
+              <w:keepNext/>
               <w:spacing w:after="0" w:before="0" w:line="240" w:lineRule="auto"/>
               <w:jc w:val="left"/>
             </w:pPr>
@@ -4049,6 +4139,7 @@
           </w:tcPr>
           <w:p>
             <w:pPr>
+              <w:keepNext/>
               <w:spacing w:after="0" w:before="0" w:line="240" w:lineRule="auto"/>
               <w:jc w:val="left"/>
             </w:pPr>
@@ -4085,6 +4176,7 @@
           </w:tcPr>
           <w:p>
             <w:pPr>
+              <w:keepNext/>
               <w:spacing w:after="0" w:before="0" w:line="240" w:lineRule="auto"/>
               <w:jc w:val="left"/>
             </w:pPr>
@@ -4115,6 +4207,7 @@
           </w:tcPr>
           <w:p>
             <w:pPr>
+              <w:keepNext w:val="false"/>
               <w:spacing w:after="0" w:before="0" w:line="240" w:lineRule="auto"/>
               <w:jc w:val="left"/>
             </w:pPr>
@@ -4151,6 +4244,7 @@
           </w:tcPr>
           <w:p>
             <w:pPr>
+              <w:keepNext w:val="false"/>
               <w:spacing w:after="0" w:before="0" w:line="240" w:lineRule="auto"/>
               <w:jc w:val="left"/>
             </w:pPr>
@@ -4187,6 +4281,7 @@
           </w:tcPr>
           <w:p>
             <w:pPr>
+              <w:keepNext w:val="false"/>
               <w:spacing w:after="0" w:before="0" w:line="240" w:lineRule="auto"/>
               <w:jc w:val="left"/>
             </w:pPr>
@@ -4259,9 +4354,9 @@
         <w:tblLayout w:type="autofit"/>
       </w:tblPr>
       <w:tblGrid>
-        <w:gridCol w:w="2669"/>
-        <w:gridCol w:w="3213"/>
-        <w:gridCol w:w="2155"/>
+        <w:gridCol w:w="2233"/>
+        <w:gridCol w:w="2631"/>
+        <w:gridCol w:w="3173"/>
         <w:gridCol w:w="988"/>
       </w:tblGrid>
       <w:tr>
@@ -4271,7 +4366,7 @@
         </w:trPr>
         <w:tc>
           <w:tcPr>
-            <w:tcW w:type="dxa" w:w="2669"/>
+            <w:tcW w:type="dxa" w:w="2233"/>
             <w:tcBorders>
               <w:top w:val="single" w:color="000000" w:sz="4"/>
               <w:left w:val="single" w:color="000000" w:sz="4"/>
@@ -4289,6 +4384,7 @@
           </w:tcPr>
           <w:p>
             <w:pPr>
+              <w:keepNext/>
               <w:spacing w:after="0" w:before="0" w:line="240" w:lineRule="auto"/>
               <w:jc w:val="center"/>
             </w:pPr>
@@ -4308,7 +4404,7 @@
         </w:tc>
         <w:tc>
           <w:tcPr>
-            <w:tcW w:type="dxa" w:w="3213"/>
+            <w:tcW w:type="dxa" w:w="2631"/>
             <w:tcBorders>
               <w:top w:val="single" w:color="000000" w:sz="4"/>
               <w:left w:val="single" w:color="000000" w:sz="4"/>
@@ -4326,6 +4422,7 @@
           </w:tcPr>
           <w:p>
             <w:pPr>
+              <w:keepNext/>
               <w:spacing w:after="0" w:before="0" w:line="240" w:lineRule="auto"/>
               <w:jc w:val="center"/>
             </w:pPr>
@@ -4345,7 +4442,7 @@
         </w:tc>
         <w:tc>
           <w:tcPr>
-            <w:tcW w:type="dxa" w:w="2155"/>
+            <w:tcW w:type="dxa" w:w="3173"/>
             <w:tcBorders>
               <w:top w:val="single" w:color="000000" w:sz="4"/>
               <w:left w:val="single" w:color="000000" w:sz="4"/>
@@ -4363,6 +4460,7 @@
           </w:tcPr>
           <w:p>
             <w:pPr>
+              <w:keepNext/>
               <w:spacing w:after="0" w:before="0" w:line="240" w:lineRule="auto"/>
               <w:jc w:val="center"/>
             </w:pPr>
@@ -4400,6 +4498,7 @@
           </w:tcPr>
           <w:p>
             <w:pPr>
+              <w:keepNext/>
               <w:spacing w:after="0" w:before="0" w:line="240" w:lineRule="auto"/>
               <w:jc w:val="center"/>
             </w:pPr>
@@ -4425,23 +4524,24 @@
         </w:trPr>
         <w:tc>
           <w:tcPr>
-            <w:tcW w:type="dxa" w:w="2669"/>
-            <w:tcBorders>
-              <w:top w:val="single" w:color="000000" w:sz="4"/>
-              <w:left w:val="single" w:color="000000" w:sz="4"/>
-              <w:bottom w:val="single" w:color="000000" w:sz="4"/>
-              <w:right w:val="single" w:color="000000" w:sz="4"/>
-            </w:tcBorders>
-            <w:tcMar>
-              <w:top w:type="dxa" w:w="30"/>
-              <w:left w:type="dxa" w:w="70"/>
-              <w:bottom w:type="dxa" w:w="30"/>
-              <w:right w:type="dxa" w:w="70"/>
-            </w:tcMar>
-            <w:vAlign w:val="center"/>
-          </w:tcPr>
-          <w:p>
-            <w:pPr>
+            <w:tcW w:type="dxa" w:w="2233"/>
+            <w:tcBorders>
+              <w:top w:val="single" w:color="000000" w:sz="4"/>
+              <w:left w:val="single" w:color="000000" w:sz="4"/>
+              <w:bottom w:val="single" w:color="000000" w:sz="4"/>
+              <w:right w:val="single" w:color="000000" w:sz="4"/>
+            </w:tcBorders>
+            <w:tcMar>
+              <w:top w:type="dxa" w:w="30"/>
+              <w:left w:type="dxa" w:w="70"/>
+              <w:bottom w:type="dxa" w:w="30"/>
+              <w:right w:type="dxa" w:w="70"/>
+            </w:tcMar>
+            <w:vAlign w:val="center"/>
+          </w:tcPr>
+          <w:p>
+            <w:pPr>
+              <w:keepNext/>
               <w:spacing w:after="0" w:before="0" w:line="240" w:lineRule="auto"/>
               <w:jc w:val="left"/>
             </w:pPr>
@@ -4485,23 +4585,24 @@
         </w:tc>
         <w:tc>
           <w:tcPr>
-            <w:tcW w:type="dxa" w:w="3213"/>
-            <w:tcBorders>
-              <w:top w:val="single" w:color="000000" w:sz="4"/>
-              <w:left w:val="single" w:color="000000" w:sz="4"/>
-              <w:bottom w:val="single" w:color="000000" w:sz="4"/>
-              <w:right w:val="single" w:color="000000" w:sz="4"/>
-            </w:tcBorders>
-            <w:tcMar>
-              <w:top w:type="dxa" w:w="30"/>
-              <w:left w:type="dxa" w:w="70"/>
-              <w:bottom w:type="dxa" w:w="30"/>
-              <w:right w:type="dxa" w:w="70"/>
-            </w:tcMar>
-            <w:vAlign w:val="center"/>
-          </w:tcPr>
-          <w:p>
-            <w:pPr>
+            <w:tcW w:type="dxa" w:w="2631"/>
+            <w:tcBorders>
+              <w:top w:val="single" w:color="000000" w:sz="4"/>
+              <w:left w:val="single" w:color="000000" w:sz="4"/>
+              <w:bottom w:val="single" w:color="000000" w:sz="4"/>
+              <w:right w:val="single" w:color="000000" w:sz="4"/>
+            </w:tcBorders>
+            <w:tcMar>
+              <w:top w:type="dxa" w:w="30"/>
+              <w:left w:type="dxa" w:w="70"/>
+              <w:bottom w:type="dxa" w:w="30"/>
+              <w:right w:type="dxa" w:w="70"/>
+            </w:tcMar>
+            <w:vAlign w:val="center"/>
+          </w:tcPr>
+          <w:p>
+            <w:pPr>
+              <w:keepNext/>
               <w:spacing w:after="0" w:before="0" w:line="240" w:lineRule="auto"/>
               <w:jc w:val="left"/>
             </w:pPr>
@@ -4522,23 +4623,24 @@
         </w:tc>
         <w:tc>
           <w:tcPr>
-            <w:tcW w:type="dxa" w:w="2155"/>
-            <w:tcBorders>
-              <w:top w:val="single" w:color="000000" w:sz="4"/>
-              <w:left w:val="single" w:color="000000" w:sz="4"/>
-              <w:bottom w:val="single" w:color="000000" w:sz="4"/>
-              <w:right w:val="single" w:color="000000" w:sz="4"/>
-            </w:tcBorders>
-            <w:tcMar>
-              <w:top w:type="dxa" w:w="30"/>
-              <w:left w:type="dxa" w:w="70"/>
-              <w:bottom w:type="dxa" w:w="30"/>
-              <w:right w:type="dxa" w:w="70"/>
-            </w:tcMar>
-            <w:vAlign w:val="center"/>
-          </w:tcPr>
-          <w:p>
-            <w:pPr>
+            <w:tcW w:type="dxa" w:w="3173"/>
+            <w:tcBorders>
+              <w:top w:val="single" w:color="000000" w:sz="4"/>
+              <w:left w:val="single" w:color="000000" w:sz="4"/>
+              <w:bottom w:val="single" w:color="000000" w:sz="4"/>
+              <w:right w:val="single" w:color="000000" w:sz="4"/>
+            </w:tcBorders>
+            <w:tcMar>
+              <w:top w:type="dxa" w:w="30"/>
+              <w:left w:type="dxa" w:w="70"/>
+              <w:bottom w:type="dxa" w:w="30"/>
+              <w:right w:type="dxa" w:w="70"/>
+            </w:tcMar>
+            <w:vAlign w:val="center"/>
+          </w:tcPr>
+          <w:p>
+            <w:pPr>
+              <w:keepNext/>
               <w:spacing w:after="0" w:before="0" w:line="240" w:lineRule="auto"/>
               <w:jc w:val="left"/>
             </w:pPr>
@@ -4563,6 +4665,7 @@
           </w:tcPr>
           <w:p>
             <w:pPr>
+              <w:keepNext/>
               <w:spacing w:after="0" w:before="0" w:line="240" w:lineRule="auto"/>
               <w:jc w:val="left"/>
             </w:pPr>
@@ -4576,23 +4679,24 @@
         </w:trPr>
         <w:tc>
           <w:tcPr>
-            <w:tcW w:type="dxa" w:w="2669"/>
-            <w:tcBorders>
-              <w:top w:val="single" w:color="000000" w:sz="4"/>
-              <w:left w:val="single" w:color="000000" w:sz="4"/>
-              <w:bottom w:val="single" w:color="000000" w:sz="4"/>
-              <w:right w:val="single" w:color="000000" w:sz="4"/>
-            </w:tcBorders>
-            <w:tcMar>
-              <w:top w:type="dxa" w:w="30"/>
-              <w:left w:type="dxa" w:w="70"/>
-              <w:bottom w:type="dxa" w:w="30"/>
-              <w:right w:type="dxa" w:w="70"/>
-            </w:tcMar>
-            <w:vAlign w:val="center"/>
-          </w:tcPr>
-          <w:p>
-            <w:pPr>
+            <w:tcW w:type="dxa" w:w="2233"/>
+            <w:tcBorders>
+              <w:top w:val="single" w:color="000000" w:sz="4"/>
+              <w:left w:val="single" w:color="000000" w:sz="4"/>
+              <w:bottom w:val="single" w:color="000000" w:sz="4"/>
+              <w:right w:val="single" w:color="000000" w:sz="4"/>
+            </w:tcBorders>
+            <w:tcMar>
+              <w:top w:type="dxa" w:w="30"/>
+              <w:left w:type="dxa" w:w="70"/>
+              <w:bottom w:type="dxa" w:w="30"/>
+              <w:right w:type="dxa" w:w="70"/>
+            </w:tcMar>
+            <w:vAlign w:val="center"/>
+          </w:tcPr>
+          <w:p>
+            <w:pPr>
+              <w:keepNext/>
               <w:spacing w:after="0" w:before="0" w:line="240" w:lineRule="auto"/>
               <w:jc w:val="left"/>
             </w:pPr>
@@ -4636,23 +4740,24 @@
         </w:tc>
         <w:tc>
           <w:tcPr>
-            <w:tcW w:type="dxa" w:w="3213"/>
-            <w:tcBorders>
-              <w:top w:val="single" w:color="000000" w:sz="4"/>
-              <w:left w:val="single" w:color="000000" w:sz="4"/>
-              <w:bottom w:val="single" w:color="000000" w:sz="4"/>
-              <w:right w:val="single" w:color="000000" w:sz="4"/>
-            </w:tcBorders>
-            <w:tcMar>
-              <w:top w:type="dxa" w:w="30"/>
-              <w:left w:type="dxa" w:w="70"/>
-              <w:bottom w:type="dxa" w:w="30"/>
-              <w:right w:type="dxa" w:w="70"/>
-            </w:tcMar>
-            <w:vAlign w:val="center"/>
-          </w:tcPr>
-          <w:p>
-            <w:pPr>
+            <w:tcW w:type="dxa" w:w="2631"/>
+            <w:tcBorders>
+              <w:top w:val="single" w:color="000000" w:sz="4"/>
+              <w:left w:val="single" w:color="000000" w:sz="4"/>
+              <w:bottom w:val="single" w:color="000000" w:sz="4"/>
+              <w:right w:val="single" w:color="000000" w:sz="4"/>
+            </w:tcBorders>
+            <w:tcMar>
+              <w:top w:type="dxa" w:w="30"/>
+              <w:left w:type="dxa" w:w="70"/>
+              <w:bottom w:type="dxa" w:w="30"/>
+              <w:right w:type="dxa" w:w="70"/>
+            </w:tcMar>
+            <w:vAlign w:val="center"/>
+          </w:tcPr>
+          <w:p>
+            <w:pPr>
+              <w:keepNext/>
               <w:spacing w:after="0" w:before="0" w:line="240" w:lineRule="auto"/>
               <w:jc w:val="left"/>
             </w:pPr>
@@ -4673,23 +4778,24 @@
         </w:tc>
         <w:tc>
           <w:tcPr>
-            <w:tcW w:type="dxa" w:w="2155"/>
-            <w:tcBorders>
-              <w:top w:val="single" w:color="000000" w:sz="4"/>
-              <w:left w:val="single" w:color="000000" w:sz="4"/>
-              <w:bottom w:val="single" w:color="000000" w:sz="4"/>
-              <w:right w:val="single" w:color="000000" w:sz="4"/>
-            </w:tcBorders>
-            <w:tcMar>
-              <w:top w:type="dxa" w:w="30"/>
-              <w:left w:type="dxa" w:w="70"/>
-              <w:bottom w:type="dxa" w:w="30"/>
-              <w:right w:type="dxa" w:w="70"/>
-            </w:tcMar>
-            <w:vAlign w:val="center"/>
-          </w:tcPr>
-          <w:p>
-            <w:pPr>
+            <w:tcW w:type="dxa" w:w="3173"/>
+            <w:tcBorders>
+              <w:top w:val="single" w:color="000000" w:sz="4"/>
+              <w:left w:val="single" w:color="000000" w:sz="4"/>
+              <w:bottom w:val="single" w:color="000000" w:sz="4"/>
+              <w:right w:val="single" w:color="000000" w:sz="4"/>
+            </w:tcBorders>
+            <w:tcMar>
+              <w:top w:type="dxa" w:w="30"/>
+              <w:left w:type="dxa" w:w="70"/>
+              <w:bottom w:type="dxa" w:w="30"/>
+              <w:right w:type="dxa" w:w="70"/>
+            </w:tcMar>
+            <w:vAlign w:val="center"/>
+          </w:tcPr>
+          <w:p>
+            <w:pPr>
+              <w:keepNext/>
               <w:spacing w:after="0" w:before="0" w:line="240" w:lineRule="auto"/>
               <w:jc w:val="left"/>
             </w:pPr>
@@ -4726,6 +4832,7 @@
           </w:tcPr>
           <w:p>
             <w:pPr>
+              <w:keepNext/>
               <w:spacing w:after="0" w:before="0" w:line="240" w:lineRule="auto"/>
               <w:jc w:val="left"/>
             </w:pPr>
@@ -4739,23 +4846,24 @@
         </w:trPr>
         <w:tc>
           <w:tcPr>
-            <w:tcW w:type="dxa" w:w="2669"/>
-            <w:tcBorders>
-              <w:top w:val="single" w:color="000000" w:sz="4"/>
-              <w:left w:val="single" w:color="000000" w:sz="4"/>
-              <w:bottom w:val="single" w:color="000000" w:sz="4"/>
-              <w:right w:val="single" w:color="000000" w:sz="4"/>
-            </w:tcBorders>
-            <w:tcMar>
-              <w:top w:type="dxa" w:w="30"/>
-              <w:left w:type="dxa" w:w="70"/>
-              <w:bottom w:type="dxa" w:w="30"/>
-              <w:right w:type="dxa" w:w="70"/>
-            </w:tcMar>
-            <w:vAlign w:val="center"/>
-          </w:tcPr>
-          <w:p>
-            <w:pPr>
+            <w:tcW w:type="dxa" w:w="2233"/>
+            <w:tcBorders>
+              <w:top w:val="single" w:color="000000" w:sz="4"/>
+              <w:left w:val="single" w:color="000000" w:sz="4"/>
+              <w:bottom w:val="single" w:color="000000" w:sz="4"/>
+              <w:right w:val="single" w:color="000000" w:sz="4"/>
+            </w:tcBorders>
+            <w:tcMar>
+              <w:top w:type="dxa" w:w="30"/>
+              <w:left w:type="dxa" w:w="70"/>
+              <w:bottom w:type="dxa" w:w="30"/>
+              <w:right w:type="dxa" w:w="70"/>
+            </w:tcMar>
+            <w:vAlign w:val="center"/>
+          </w:tcPr>
+          <w:p>
+            <w:pPr>
+              <w:keepNext/>
               <w:spacing w:after="0" w:before="0" w:line="240" w:lineRule="auto"/>
               <w:jc w:val="left"/>
             </w:pPr>
@@ -4775,23 +4883,24 @@
         </w:tc>
         <w:tc>
           <w:tcPr>
-            <w:tcW w:type="dxa" w:w="3213"/>
-            <w:tcBorders>
-              <w:top w:val="single" w:color="000000" w:sz="4"/>
-              <w:left w:val="single" w:color="000000" w:sz="4"/>
-              <w:bottom w:val="single" w:color="000000" w:sz="4"/>
-              <w:right w:val="single" w:color="000000" w:sz="4"/>
-            </w:tcBorders>
-            <w:tcMar>
-              <w:top w:type="dxa" w:w="30"/>
-              <w:left w:type="dxa" w:w="70"/>
-              <w:bottom w:type="dxa" w:w="30"/>
-              <w:right w:type="dxa" w:w="70"/>
-            </w:tcMar>
-            <w:vAlign w:val="center"/>
-          </w:tcPr>
-          <w:p>
-            <w:pPr>
+            <w:tcW w:type="dxa" w:w="2631"/>
+            <w:tcBorders>
+              <w:top w:val="single" w:color="000000" w:sz="4"/>
+              <w:left w:val="single" w:color="000000" w:sz="4"/>
+              <w:bottom w:val="single" w:color="000000" w:sz="4"/>
+              <w:right w:val="single" w:color="000000" w:sz="4"/>
+            </w:tcBorders>
+            <w:tcMar>
+              <w:top w:type="dxa" w:w="30"/>
+              <w:left w:type="dxa" w:w="70"/>
+              <w:bottom w:type="dxa" w:w="30"/>
+              <w:right w:type="dxa" w:w="70"/>
+            </w:tcMar>
+            <w:vAlign w:val="center"/>
+          </w:tcPr>
+          <w:p>
+            <w:pPr>
+              <w:keepNext/>
               <w:spacing w:after="0" w:before="0" w:line="240" w:lineRule="auto"/>
               <w:jc w:val="left"/>
             </w:pPr>
@@ -4811,23 +4920,24 @@
         </w:tc>
         <w:tc>
           <w:tcPr>
-            <w:tcW w:type="dxa" w:w="2155"/>
-            <w:tcBorders>
-              <w:top w:val="single" w:color="000000" w:sz="4"/>
-              <w:left w:val="single" w:color="000000" w:sz="4"/>
-              <w:bottom w:val="single" w:color="000000" w:sz="4"/>
-              <w:right w:val="single" w:color="000000" w:sz="4"/>
-            </w:tcBorders>
-            <w:tcMar>
-              <w:top w:type="dxa" w:w="30"/>
-              <w:left w:type="dxa" w:w="70"/>
-              <w:bottom w:type="dxa" w:w="30"/>
-              <w:right w:type="dxa" w:w="70"/>
-            </w:tcMar>
-            <w:vAlign w:val="center"/>
-          </w:tcPr>
-          <w:p>
-            <w:pPr>
+            <w:tcW w:type="dxa" w:w="3173"/>
+            <w:tcBorders>
+              <w:top w:val="single" w:color="000000" w:sz="4"/>
+              <w:left w:val="single" w:color="000000" w:sz="4"/>
+              <w:bottom w:val="single" w:color="000000" w:sz="4"/>
+              <w:right w:val="single" w:color="000000" w:sz="4"/>
+            </w:tcBorders>
+            <w:tcMar>
+              <w:top w:type="dxa" w:w="30"/>
+              <w:left w:type="dxa" w:w="70"/>
+              <w:bottom w:type="dxa" w:w="30"/>
+              <w:right w:type="dxa" w:w="70"/>
+            </w:tcMar>
+            <w:vAlign w:val="center"/>
+          </w:tcPr>
+          <w:p>
+            <w:pPr>
+              <w:keepNext/>
               <w:spacing w:after="0" w:before="0" w:line="240" w:lineRule="auto"/>
               <w:jc w:val="left"/>
             </w:pPr>
@@ -4864,6 +4974,7 @@
           </w:tcPr>
           <w:p>
             <w:pPr>
+              <w:keepNext/>
               <w:spacing w:after="0" w:before="0" w:line="240" w:lineRule="auto"/>
               <w:jc w:val="left"/>
             </w:pPr>
@@ -4877,23 +4988,24 @@
         </w:trPr>
         <w:tc>
           <w:tcPr>
-            <w:tcW w:type="dxa" w:w="2669"/>
-            <w:tcBorders>
-              <w:top w:val="single" w:color="000000" w:sz="4"/>
-              <w:left w:val="single" w:color="000000" w:sz="4"/>
-              <w:bottom w:val="single" w:color="000000" w:sz="4"/>
-              <w:right w:val="single" w:color="000000" w:sz="4"/>
-            </w:tcBorders>
-            <w:tcMar>
-              <w:top w:type="dxa" w:w="30"/>
-              <w:left w:type="dxa" w:w="70"/>
-              <w:bottom w:type="dxa" w:w="30"/>
-              <w:right w:type="dxa" w:w="70"/>
-            </w:tcMar>
-            <w:vAlign w:val="center"/>
-          </w:tcPr>
-          <w:p>
-            <w:pPr>
+            <w:tcW w:type="dxa" w:w="2233"/>
+            <w:tcBorders>
+              <w:top w:val="single" w:color="000000" w:sz="4"/>
+              <w:left w:val="single" w:color="000000" w:sz="4"/>
+              <w:bottom w:val="single" w:color="000000" w:sz="4"/>
+              <w:right w:val="single" w:color="000000" w:sz="4"/>
+            </w:tcBorders>
+            <w:tcMar>
+              <w:top w:type="dxa" w:w="30"/>
+              <w:left w:type="dxa" w:w="70"/>
+              <w:bottom w:type="dxa" w:w="30"/>
+              <w:right w:type="dxa" w:w="70"/>
+            </w:tcMar>
+            <w:vAlign w:val="center"/>
+          </w:tcPr>
+          <w:p>
+            <w:pPr>
+              <w:keepNext w:val="false"/>
               <w:spacing w:after="0" w:before="0" w:line="240" w:lineRule="auto"/>
               <w:jc w:val="left"/>
             </w:pPr>
@@ -4913,23 +5025,24 @@
         </w:tc>
         <w:tc>
           <w:tcPr>
-            <w:tcW w:type="dxa" w:w="3213"/>
-            <w:tcBorders>
-              <w:top w:val="single" w:color="000000" w:sz="4"/>
-              <w:left w:val="single" w:color="000000" w:sz="4"/>
-              <w:bottom w:val="single" w:color="000000" w:sz="4"/>
-              <w:right w:val="single" w:color="000000" w:sz="4"/>
-            </w:tcBorders>
-            <w:tcMar>
-              <w:top w:type="dxa" w:w="30"/>
-              <w:left w:type="dxa" w:w="70"/>
-              <w:bottom w:type="dxa" w:w="30"/>
-              <w:right w:type="dxa" w:w="70"/>
-            </w:tcMar>
-            <w:vAlign w:val="center"/>
-          </w:tcPr>
-          <w:p>
-            <w:pPr>
+            <w:tcW w:type="dxa" w:w="2631"/>
+            <w:tcBorders>
+              <w:top w:val="single" w:color="000000" w:sz="4"/>
+              <w:left w:val="single" w:color="000000" w:sz="4"/>
+              <w:bottom w:val="single" w:color="000000" w:sz="4"/>
+              <w:right w:val="single" w:color="000000" w:sz="4"/>
+            </w:tcBorders>
+            <w:tcMar>
+              <w:top w:type="dxa" w:w="30"/>
+              <w:left w:type="dxa" w:w="70"/>
+              <w:bottom w:type="dxa" w:w="30"/>
+              <w:right w:type="dxa" w:w="70"/>
+            </w:tcMar>
+            <w:vAlign w:val="center"/>
+          </w:tcPr>
+          <w:p>
+            <w:pPr>
+              <w:keepNext w:val="false"/>
               <w:spacing w:after="0" w:before="0" w:line="240" w:lineRule="auto"/>
               <w:jc w:val="left"/>
             </w:pPr>
@@ -4949,23 +5062,24 @@
         </w:tc>
         <w:tc>
           <w:tcPr>
-            <w:tcW w:type="dxa" w:w="2155"/>
-            <w:tcBorders>
-              <w:top w:val="single" w:color="000000" w:sz="4"/>
-              <w:left w:val="single" w:color="000000" w:sz="4"/>
-              <w:bottom w:val="single" w:color="000000" w:sz="4"/>
-              <w:right w:val="single" w:color="000000" w:sz="4"/>
-            </w:tcBorders>
-            <w:tcMar>
-              <w:top w:type="dxa" w:w="30"/>
-              <w:left w:type="dxa" w:w="70"/>
-              <w:bottom w:type="dxa" w:w="30"/>
-              <w:right w:type="dxa" w:w="70"/>
-            </w:tcMar>
-            <w:vAlign w:val="center"/>
-          </w:tcPr>
-          <w:p>
-            <w:pPr>
+            <w:tcW w:type="dxa" w:w="3173"/>
+            <w:tcBorders>
+              <w:top w:val="single" w:color="000000" w:sz="4"/>
+              <w:left w:val="single" w:color="000000" w:sz="4"/>
+              <w:bottom w:val="single" w:color="000000" w:sz="4"/>
+              <w:right w:val="single" w:color="000000" w:sz="4"/>
+            </w:tcBorders>
+            <w:tcMar>
+              <w:top w:type="dxa" w:w="30"/>
+              <w:left w:type="dxa" w:w="70"/>
+              <w:bottom w:type="dxa" w:w="30"/>
+              <w:right w:type="dxa" w:w="70"/>
+            </w:tcMar>
+            <w:vAlign w:val="center"/>
+          </w:tcPr>
+          <w:p>
+            <w:pPr>
+              <w:keepNext w:val="false"/>
               <w:spacing w:after="0" w:before="0" w:line="240" w:lineRule="auto"/>
               <w:jc w:val="left"/>
             </w:pPr>
@@ -4990,6 +5104,7 @@
           </w:tcPr>
           <w:p>
             <w:pPr>
+              <w:keepNext w:val="false"/>
               <w:spacing w:after="0" w:before="0" w:line="240" w:lineRule="auto"/>
               <w:jc w:val="left"/>
             </w:pPr>
@@ -5084,6 +5199,7 @@
           </w:tcPr>
           <w:p>
             <w:pPr>
+              <w:keepNext/>
               <w:spacing w:after="0" w:before="0" w:line="240" w:lineRule="auto"/>
               <w:jc w:val="center"/>
             </w:pPr>
@@ -5121,6 +5237,7 @@
           </w:tcPr>
           <w:p>
             <w:pPr>
+              <w:keepNext/>
               <w:spacing w:after="0" w:before="0" w:line="240" w:lineRule="auto"/>
               <w:jc w:val="center"/>
             </w:pPr>
@@ -5163,6 +5280,7 @@
           </w:tcPr>
           <w:p>
             <w:pPr>
+              <w:keepNext/>
               <w:spacing w:after="0" w:before="0" w:line="240" w:lineRule="auto"/>
               <w:jc w:val="left"/>
             </w:pPr>
@@ -5199,6 +5317,7 @@
           </w:tcPr>
           <w:p>
             <w:pPr>
+              <w:keepNext/>
               <w:spacing w:after="0" w:before="0" w:line="240" w:lineRule="auto"/>
               <w:jc w:val="left"/>
             </w:pPr>
@@ -5242,6 +5361,7 @@
           </w:tcPr>
           <w:p>
             <w:pPr>
+              <w:keepNext/>
               <w:spacing w:after="0" w:before="0" w:line="240" w:lineRule="auto"/>
               <w:jc w:val="left"/>
             </w:pPr>
@@ -5278,6 +5398,7 @@
           </w:tcPr>
           <w:p>
             <w:pPr>
+              <w:keepNext/>
               <w:spacing w:after="0" w:before="0" w:line="240" w:lineRule="auto"/>
               <w:jc w:val="left"/>
             </w:pPr>
@@ -5321,6 +5442,7 @@
           </w:tcPr>
           <w:p>
             <w:pPr>
+              <w:keepNext/>
               <w:spacing w:after="0" w:before="0" w:line="240" w:lineRule="auto"/>
               <w:jc w:val="left"/>
             </w:pPr>
@@ -5357,6 +5479,7 @@
           </w:tcPr>
           <w:p>
             <w:pPr>
+              <w:keepNext/>
               <w:spacing w:after="0" w:before="0" w:line="240" w:lineRule="auto"/>
               <w:jc w:val="left"/>
             </w:pPr>
@@ -5424,6 +5547,7 @@
           </w:tcPr>
           <w:p>
             <w:pPr>
+              <w:keepNext/>
               <w:spacing w:after="0" w:before="0" w:line="240" w:lineRule="auto"/>
               <w:jc w:val="left"/>
             </w:pPr>
@@ -5460,6 +5584,7 @@
           </w:tcPr>
           <w:p>
             <w:pPr>
+              <w:keepNext/>
               <w:spacing w:after="0" w:before="0" w:line="240" w:lineRule="auto"/>
               <w:jc w:val="left"/>
             </w:pPr>
@@ -5527,6 +5652,7 @@
           </w:tcPr>
           <w:p>
             <w:pPr>
+              <w:keepNext w:val="false"/>
               <w:spacing w:after="0" w:before="0" w:line="240" w:lineRule="auto"/>
               <w:jc w:val="left"/>
             </w:pPr>
@@ -5563,6 +5689,7 @@
           </w:tcPr>
           <w:p>
             <w:pPr>
+              <w:keepNext w:val="false"/>
               <w:spacing w:after="0" w:before="0" w:line="240" w:lineRule="auto"/>
               <w:jc w:val="left"/>
             </w:pPr>
@@ -5623,12 +5750,12 @@
         <w:tblLayout w:type="autofit"/>
       </w:tblPr>
       <w:tblGrid>
-        <w:gridCol w:w="2537"/>
+        <w:gridCol w:w="2137"/>
         <w:gridCol w:w="772"/>
-        <w:gridCol w:w="2255"/>
+        <w:gridCol w:w="1925"/>
         <w:gridCol w:w="1773"/>
-        <w:gridCol w:w="772"/>
-        <w:gridCol w:w="916"/>
+        <w:gridCol w:w="970"/>
+        <w:gridCol w:w="1448"/>
       </w:tblGrid>
       <w:tr>
         <w:trPr>
@@ -5637,7 +5764,7 @@
         </w:trPr>
         <w:tc>
           <w:tcPr>
-            <w:tcW w:type="dxa" w:w="2537"/>
+            <w:tcW w:type="dxa" w:w="2137"/>
             <w:tcBorders>
               <w:top w:val="single" w:color="000000" w:sz="4"/>
               <w:left w:val="single" w:color="000000" w:sz="4"/>
@@ -5655,6 +5782,7 @@
           </w:tcPr>
           <w:p>
             <w:pPr>
+              <w:keepNext/>
               <w:spacing w:after="0" w:before="0" w:line="240" w:lineRule="auto"/>
               <w:jc w:val="center"/>
             </w:pPr>
@@ -5692,6 +5820,7 @@
           </w:tcPr>
           <w:p>
             <w:pPr>
+              <w:keepNext/>
               <w:spacing w:after="0" w:before="0" w:line="240" w:lineRule="auto"/>
               <w:jc w:val="center"/>
             </w:pPr>
@@ -5711,7 +5840,7 @@
         </w:tc>
         <w:tc>
           <w:tcPr>
-            <w:tcW w:type="dxa" w:w="2255"/>
+            <w:tcW w:type="dxa" w:w="1925"/>
             <w:tcBorders>
               <w:top w:val="single" w:color="000000" w:sz="4"/>
               <w:left w:val="single" w:color="000000" w:sz="4"/>
@@ -5729,6 +5858,7 @@
           </w:tcPr>
           <w:p>
             <w:pPr>
+              <w:keepNext/>
               <w:spacing w:after="0" w:before="0" w:line="240" w:lineRule="auto"/>
               <w:jc w:val="center"/>
             </w:pPr>
@@ -5766,6 +5896,7 @@
           </w:tcPr>
           <w:p>
             <w:pPr>
+              <w:keepNext/>
               <w:spacing w:after="0" w:before="0" w:line="240" w:lineRule="auto"/>
               <w:jc w:val="center"/>
             </w:pPr>
@@ -5785,7 +5916,7 @@
         </w:tc>
         <w:tc>
           <w:tcPr>
-            <w:tcW w:type="dxa" w:w="772"/>
+            <w:tcW w:type="dxa" w:w="970"/>
             <w:tcBorders>
               <w:top w:val="single" w:color="000000" w:sz="4"/>
               <w:left w:val="single" w:color="000000" w:sz="4"/>
@@ -5803,6 +5934,7 @@
           </w:tcPr>
           <w:p>
             <w:pPr>
+              <w:keepNext/>
               <w:spacing w:after="0" w:before="0" w:line="240" w:lineRule="auto"/>
               <w:jc w:val="center"/>
             </w:pPr>
@@ -5822,7 +5954,7 @@
         </w:tc>
         <w:tc>
           <w:tcPr>
-            <w:tcW w:type="dxa" w:w="916"/>
+            <w:tcW w:type="dxa" w:w="1448"/>
             <w:tcBorders>
               <w:top w:val="single" w:color="000000" w:sz="4"/>
               <w:left w:val="single" w:color="000000" w:sz="4"/>
@@ -5840,6 +5972,7 @@
           </w:tcPr>
           <w:p>
             <w:pPr>
+              <w:keepNext/>
               <w:spacing w:after="0" w:before="0" w:line="240" w:lineRule="auto"/>
               <w:jc w:val="center"/>
             </w:pPr>
@@ -5865,23 +5998,24 @@
         </w:trPr>
         <w:tc>
           <w:tcPr>
-            <w:tcW w:type="dxa" w:w="2537"/>
-            <w:tcBorders>
-              <w:top w:val="single" w:color="000000" w:sz="4"/>
-              <w:left w:val="single" w:color="000000" w:sz="4"/>
-              <w:bottom w:val="single" w:color="000000" w:sz="4"/>
-              <w:right w:val="single" w:color="000000" w:sz="4"/>
-            </w:tcBorders>
-            <w:tcMar>
-              <w:top w:type="dxa" w:w="30"/>
-              <w:left w:type="dxa" w:w="70"/>
-              <w:bottom w:type="dxa" w:w="30"/>
-              <w:right w:type="dxa" w:w="70"/>
-            </w:tcMar>
-            <w:vAlign w:val="center"/>
-          </w:tcPr>
-          <w:p>
-            <w:pPr>
+            <w:tcW w:type="dxa" w:w="2137"/>
+            <w:tcBorders>
+              <w:top w:val="single" w:color="000000" w:sz="4"/>
+              <w:left w:val="single" w:color="000000" w:sz="4"/>
+              <w:bottom w:val="single" w:color="000000" w:sz="4"/>
+              <w:right w:val="single" w:color="000000" w:sz="4"/>
+            </w:tcBorders>
+            <w:tcMar>
+              <w:top w:type="dxa" w:w="30"/>
+              <w:left w:type="dxa" w:w="70"/>
+              <w:bottom w:type="dxa" w:w="30"/>
+              <w:right w:type="dxa" w:w="70"/>
+            </w:tcMar>
+            <w:vAlign w:val="center"/>
+          </w:tcPr>
+          <w:p>
+            <w:pPr>
+              <w:keepNext w:val="false"/>
               <w:spacing w:after="0" w:before="0" w:line="240" w:lineRule="auto"/>
               <w:jc w:val="left"/>
             </w:pPr>
@@ -5919,30 +6053,32 @@
           </w:tcPr>
           <w:p>
             <w:pPr>
-              <w:spacing w:after="0" w:before="0" w:line="240" w:lineRule="auto"/>
-              <w:jc w:val="left"/>
-            </w:pPr>
-          </w:p>
-        </w:tc>
-        <w:tc>
-          <w:tcPr>
-            <w:tcW w:type="dxa" w:w="2255"/>
-            <w:tcBorders>
-              <w:top w:val="single" w:color="000000" w:sz="4"/>
-              <w:left w:val="single" w:color="000000" w:sz="4"/>
-              <w:bottom w:val="single" w:color="000000" w:sz="4"/>
-              <w:right w:val="single" w:color="000000" w:sz="4"/>
-            </w:tcBorders>
-            <w:tcMar>
-              <w:top w:type="dxa" w:w="30"/>
-              <w:left w:type="dxa" w:w="70"/>
-              <w:bottom w:type="dxa" w:w="30"/>
-              <w:right w:type="dxa" w:w="70"/>
-            </w:tcMar>
-            <w:vAlign w:val="center"/>
-          </w:tcPr>
-          <w:p>
-            <w:pPr>
+              <w:keepNext w:val="false"/>
+              <w:spacing w:after="0" w:before="0" w:line="240" w:lineRule="auto"/>
+              <w:jc w:val="left"/>
+            </w:pPr>
+          </w:p>
+        </w:tc>
+        <w:tc>
+          <w:tcPr>
+            <w:tcW w:type="dxa" w:w="1925"/>
+            <w:tcBorders>
+              <w:top w:val="single" w:color="000000" w:sz="4"/>
+              <w:left w:val="single" w:color="000000" w:sz="4"/>
+              <w:bottom w:val="single" w:color="000000" w:sz="4"/>
+              <w:right w:val="single" w:color="000000" w:sz="4"/>
+            </w:tcBorders>
+            <w:tcMar>
+              <w:top w:type="dxa" w:w="30"/>
+              <w:left w:type="dxa" w:w="70"/>
+              <w:bottom w:type="dxa" w:w="30"/>
+              <w:right w:type="dxa" w:w="70"/>
+            </w:tcMar>
+            <w:vAlign w:val="center"/>
+          </w:tcPr>
+          <w:p>
+            <w:pPr>
+              <w:keepNext w:val="false"/>
               <w:spacing w:after="0" w:before="0" w:line="240" w:lineRule="auto"/>
               <w:jc w:val="left"/>
             </w:pPr>
@@ -5979,54 +6115,57 @@
           </w:tcPr>
           <w:p>
             <w:pPr>
-              <w:spacing w:after="0" w:before="0" w:line="240" w:lineRule="auto"/>
-              <w:jc w:val="left"/>
-            </w:pPr>
-          </w:p>
-        </w:tc>
-        <w:tc>
-          <w:tcPr>
-            <w:tcW w:type="dxa" w:w="772"/>
-            <w:tcBorders>
-              <w:top w:val="single" w:color="000000" w:sz="4"/>
-              <w:left w:val="single" w:color="000000" w:sz="4"/>
-              <w:bottom w:val="single" w:color="000000" w:sz="4"/>
-              <w:right w:val="single" w:color="000000" w:sz="4"/>
-            </w:tcBorders>
-            <w:tcMar>
-              <w:top w:type="dxa" w:w="30"/>
-              <w:left w:type="dxa" w:w="70"/>
-              <w:bottom w:type="dxa" w:w="30"/>
-              <w:right w:type="dxa" w:w="70"/>
-            </w:tcMar>
-            <w:vAlign w:val="center"/>
-          </w:tcPr>
-          <w:p>
-            <w:pPr>
-              <w:spacing w:after="0" w:before="0" w:line="240" w:lineRule="auto"/>
-              <w:jc w:val="left"/>
-            </w:pPr>
-          </w:p>
-        </w:tc>
-        <w:tc>
-          <w:tcPr>
-            <w:tcW w:type="dxa" w:w="916"/>
-            <w:tcBorders>
-              <w:top w:val="single" w:color="000000" w:sz="4"/>
-              <w:left w:val="single" w:color="000000" w:sz="4"/>
-              <w:bottom w:val="single" w:color="000000" w:sz="4"/>
-              <w:right w:val="single" w:color="000000" w:sz="4"/>
-            </w:tcBorders>
-            <w:tcMar>
-              <w:top w:type="dxa" w:w="30"/>
-              <w:left w:type="dxa" w:w="70"/>
-              <w:bottom w:type="dxa" w:w="30"/>
-              <w:right w:type="dxa" w:w="70"/>
-            </w:tcMar>
-            <w:vAlign w:val="center"/>
-          </w:tcPr>
-          <w:p>
-            <w:pPr>
+              <w:keepNext w:val="false"/>
+              <w:spacing w:after="0" w:before="0" w:line="240" w:lineRule="auto"/>
+              <w:jc w:val="left"/>
+            </w:pPr>
+          </w:p>
+        </w:tc>
+        <w:tc>
+          <w:tcPr>
+            <w:tcW w:type="dxa" w:w="970"/>
+            <w:tcBorders>
+              <w:top w:val="single" w:color="000000" w:sz="4"/>
+              <w:left w:val="single" w:color="000000" w:sz="4"/>
+              <w:bottom w:val="single" w:color="000000" w:sz="4"/>
+              <w:right w:val="single" w:color="000000" w:sz="4"/>
+            </w:tcBorders>
+            <w:tcMar>
+              <w:top w:type="dxa" w:w="30"/>
+              <w:left w:type="dxa" w:w="70"/>
+              <w:bottom w:type="dxa" w:w="30"/>
+              <w:right w:type="dxa" w:w="70"/>
+            </w:tcMar>
+            <w:vAlign w:val="center"/>
+          </w:tcPr>
+          <w:p>
+            <w:pPr>
+              <w:keepNext w:val="false"/>
+              <w:spacing w:after="0" w:before="0" w:line="240" w:lineRule="auto"/>
+              <w:jc w:val="left"/>
+            </w:pPr>
+          </w:p>
+        </w:tc>
+        <w:tc>
+          <w:tcPr>
+            <w:tcW w:type="dxa" w:w="1448"/>
+            <w:tcBorders>
+              <w:top w:val="single" w:color="000000" w:sz="4"/>
+              <w:left w:val="single" w:color="000000" w:sz="4"/>
+              <w:bottom w:val="single" w:color="000000" w:sz="4"/>
+              <w:right w:val="single" w:color="000000" w:sz="4"/>
+            </w:tcBorders>
+            <w:tcMar>
+              <w:top w:type="dxa" w:w="30"/>
+              <w:left w:type="dxa" w:w="70"/>
+              <w:bottom w:type="dxa" w:w="30"/>
+              <w:right w:type="dxa" w:w="70"/>
+            </w:tcMar>
+            <w:vAlign w:val="center"/>
+          </w:tcPr>
+          <w:p>
+            <w:pPr>
+              <w:keepNext w:val="false"/>
               <w:spacing w:after="0" w:before="0" w:line="240" w:lineRule="auto"/>
               <w:jc w:val="left"/>
             </w:pPr>
@@ -6122,6 +6261,7 @@
           </w:tcPr>
           <w:p>
             <w:pPr>
+              <w:keepNext/>
               <w:spacing w:after="0" w:before="0" w:line="240" w:lineRule="auto"/>
               <w:jc w:val="center"/>
             </w:pPr>
@@ -6159,6 +6299,7 @@
           </w:tcPr>
           <w:p>
             <w:pPr>
+              <w:keepNext/>
               <w:spacing w:after="0" w:before="0" w:line="240" w:lineRule="auto"/>
               <w:jc w:val="center"/>
             </w:pPr>
@@ -6196,6 +6337,7 @@
           </w:tcPr>
           <w:p>
             <w:pPr>
+              <w:keepNext/>
               <w:spacing w:after="0" w:before="0" w:line="240" w:lineRule="auto"/>
               <w:jc w:val="center"/>
             </w:pPr>
@@ -6238,6 +6380,7 @@
           </w:tcPr>
           <w:p>
             <w:pPr>
+              <w:keepNext/>
               <w:spacing w:after="0" w:before="0" w:line="240" w:lineRule="auto"/>
               <w:jc w:val="left"/>
             </w:pPr>
@@ -6274,6 +6417,7 @@
           </w:tcPr>
           <w:p>
             <w:pPr>
+              <w:keepNext/>
               <w:spacing w:after="0" w:before="0" w:line="240" w:lineRule="auto"/>
               <w:jc w:val="left"/>
             </w:pPr>
@@ -6298,6 +6442,7 @@
           </w:tcPr>
           <w:p>
             <w:pPr>
+              <w:keepNext/>
               <w:spacing w:after="0" w:before="0" w:line="240" w:lineRule="auto"/>
               <w:jc w:val="left"/>
             </w:pPr>
@@ -6340,6 +6485,7 @@
           </w:tcPr>
           <w:p>
             <w:pPr>
+              <w:keepNext/>
               <w:spacing w:after="0" w:before="0" w:line="240" w:lineRule="auto"/>
               <w:jc w:val="left"/>
             </w:pPr>
@@ -6376,6 +6522,7 @@
           </w:tcPr>
           <w:p>
             <w:pPr>
+              <w:keepNext/>
               <w:spacing w:after="0" w:before="0" w:line="240" w:lineRule="auto"/>
               <w:jc w:val="left"/>
             </w:pPr>
@@ -6412,6 +6559,7 @@
           </w:tcPr>
           <w:p>
             <w:pPr>
+              <w:keepNext/>
               <w:spacing w:after="0" w:before="0" w:line="240" w:lineRule="auto"/>
               <w:jc w:val="left"/>
             </w:pPr>
@@ -6442,6 +6590,7 @@
           </w:tcPr>
           <w:p>
             <w:pPr>
+              <w:keepNext/>
               <w:spacing w:after="0" w:before="0" w:line="240" w:lineRule="auto"/>
               <w:jc w:val="left"/>
             </w:pPr>
@@ -6478,6 +6627,7 @@
           </w:tcPr>
           <w:p>
             <w:pPr>
+              <w:keepNext/>
               <w:spacing w:after="0" w:before="0" w:line="240" w:lineRule="auto"/>
               <w:jc w:val="left"/>
             </w:pPr>
@@ -6502,6 +6652,7 @@
           </w:tcPr>
           <w:p>
             <w:pPr>
+              <w:keepNext/>
               <w:spacing w:after="0" w:before="0" w:line="240" w:lineRule="auto"/>
               <w:jc w:val="left"/>
             </w:pPr>
@@ -6532,6 +6683,7 @@
           </w:tcPr>
           <w:p>
             <w:pPr>
+              <w:keepNext/>
               <w:spacing w:after="0" w:before="0" w:line="240" w:lineRule="auto"/>
               <w:jc w:val="left"/>
             </w:pPr>
@@ -6568,6 +6720,7 @@
           </w:tcPr>
           <w:p>
             <w:pPr>
+              <w:keepNext/>
               <w:spacing w:after="0" w:before="0" w:line="240" w:lineRule="auto"/>
               <w:jc w:val="left"/>
             </w:pPr>
@@ -6604,6 +6757,7 @@
           </w:tcPr>
           <w:p>
             <w:pPr>
+              <w:keepNext/>
               <w:spacing w:after="0" w:before="0" w:line="240" w:lineRule="auto"/>
               <w:jc w:val="left"/>
             </w:pPr>
@@ -6634,6 +6788,7 @@
           </w:tcPr>
           <w:p>
             <w:pPr>
+              <w:keepNext/>
               <w:spacing w:after="0" w:before="0" w:line="240" w:lineRule="auto"/>
               <w:jc w:val="left"/>
             </w:pPr>
@@ -6670,6 +6825,7 @@
           </w:tcPr>
           <w:p>
             <w:pPr>
+              <w:keepNext/>
               <w:spacing w:after="0" w:before="0" w:line="240" w:lineRule="auto"/>
               <w:jc w:val="left"/>
             </w:pPr>
@@ -6694,6 +6850,7 @@
           </w:tcPr>
           <w:p>
             <w:pPr>
+              <w:keepNext/>
               <w:spacing w:after="0" w:before="0" w:line="240" w:lineRule="auto"/>
               <w:jc w:val="left"/>
             </w:pPr>
@@ -6724,6 +6881,7 @@
           </w:tcPr>
           <w:p>
             <w:pPr>
+              <w:keepNext/>
               <w:spacing w:after="0" w:before="0" w:line="240" w:lineRule="auto"/>
               <w:jc w:val="left"/>
             </w:pPr>
@@ -6760,6 +6918,7 @@
           </w:tcPr>
           <w:p>
             <w:pPr>
+              <w:keepNext/>
               <w:spacing w:after="0" w:before="0" w:line="240" w:lineRule="auto"/>
               <w:jc w:val="left"/>
             </w:pPr>
@@ -6784,6 +6943,7 @@
           </w:tcPr>
           <w:p>
             <w:pPr>
+              <w:keepNext/>
               <w:spacing w:after="0" w:before="0" w:line="240" w:lineRule="auto"/>
               <w:jc w:val="left"/>
             </w:pPr>
@@ -6814,6 +6974,7 @@
           </w:tcPr>
           <w:p>
             <w:pPr>
+              <w:keepNext w:val="false"/>
               <w:spacing w:after="0" w:before="0" w:line="240" w:lineRule="auto"/>
               <w:jc w:val="left"/>
             </w:pPr>
@@ -6850,6 +7011,7 @@
           </w:tcPr>
           <w:p>
             <w:pPr>
+              <w:keepNext w:val="false"/>
               <w:spacing w:after="0" w:before="0" w:line="240" w:lineRule="auto"/>
               <w:jc w:val="left"/>
             </w:pPr>
@@ -6874,6 +7036,7 @@
           </w:tcPr>
           <w:p>
             <w:pPr>
+              <w:keepNext w:val="false"/>
               <w:spacing w:after="0" w:before="0" w:line="240" w:lineRule="auto"/>
               <w:jc w:val="left"/>
             </w:pPr>
@@ -6950,6 +7113,7 @@
           </w:tcPr>
           <w:p>
             <w:pPr>
+              <w:keepNext/>
               <w:spacing w:after="0" w:before="0" w:line="240" w:lineRule="auto"/>
               <w:jc w:val="center"/>
             </w:pPr>
@@ -6987,6 +7151,7 @@
           </w:tcPr>
           <w:p>
             <w:pPr>
+              <w:keepNext/>
               <w:spacing w:after="0" w:before="0" w:line="240" w:lineRule="auto"/>
               <w:jc w:val="center"/>
             </w:pPr>
@@ -7024,6 +7189,7 @@
           </w:tcPr>
           <w:p>
             <w:pPr>
+              <w:keepNext/>
               <w:spacing w:after="0" w:before="0" w:line="240" w:lineRule="auto"/>
               <w:jc w:val="center"/>
             </w:pPr>
@@ -7066,6 +7232,7 @@
           </w:tcPr>
           <w:p>
             <w:pPr>
+              <w:keepNext/>
               <w:spacing w:after="0" w:before="0" w:line="240" w:lineRule="auto"/>
               <w:jc w:val="left"/>
             </w:pPr>
@@ -7103,6 +7270,7 @@
           </w:tcPr>
           <w:p>
             <w:pPr>
+              <w:keepNext/>
               <w:spacing w:after="0" w:before="0" w:line="240" w:lineRule="auto"/>
               <w:jc w:val="left"/>
             </w:pPr>
@@ -7139,6 +7307,7 @@
           </w:tcPr>
           <w:p>
             <w:pPr>
+              <w:keepNext/>
               <w:spacing w:after="0" w:before="0" w:line="240" w:lineRule="auto"/>
               <w:jc w:val="left"/>
             </w:pPr>
@@ -7169,6 +7338,7 @@
           </w:tcPr>
           <w:p>
             <w:pPr>
+              <w:keepNext/>
               <w:spacing w:after="0" w:before="0" w:line="240" w:lineRule="auto"/>
               <w:jc w:val="left"/>
             </w:pPr>
@@ -7206,6 +7376,7 @@
           </w:tcPr>
           <w:p>
             <w:pPr>
+              <w:keepNext/>
               <w:spacing w:after="0" w:before="0" w:line="240" w:lineRule="auto"/>
               <w:jc w:val="left"/>
             </w:pPr>
@@ -7230,6 +7401,7 @@
           </w:tcPr>
           <w:p>
             <w:pPr>
+              <w:keepNext/>
               <w:spacing w:after="0" w:before="0" w:line="240" w:lineRule="auto"/>
               <w:jc w:val="left"/>
             </w:pPr>
@@ -7260,6 +7432,7 @@
           </w:tcPr>
           <w:p>
             <w:pPr>
+              <w:keepNext/>
               <w:spacing w:after="0" w:before="0" w:line="240" w:lineRule="auto"/>
               <w:jc w:val="left"/>
             </w:pPr>
@@ -7296,6 +7469,7 @@
           </w:tcPr>
           <w:p>
             <w:pPr>
+              <w:keepNext/>
               <w:spacing w:after="0" w:before="0" w:line="240" w:lineRule="auto"/>
               <w:jc w:val="left"/>
             </w:pPr>
@@ -7332,6 +7506,7 @@
           </w:tcPr>
           <w:p>
             <w:pPr>
+              <w:keepNext/>
               <w:spacing w:after="0" w:before="0" w:line="240" w:lineRule="auto"/>
               <w:jc w:val="left"/>
             </w:pPr>
@@ -7362,6 +7537,7 @@
           </w:tcPr>
           <w:p>
             <w:pPr>
+              <w:keepNext/>
               <w:spacing w:after="0" w:before="0" w:line="240" w:lineRule="auto"/>
               <w:jc w:val="left"/>
             </w:pPr>
@@ -7398,6 +7574,7 @@
           </w:tcPr>
           <w:p>
             <w:pPr>
+              <w:keepNext/>
               <w:spacing w:after="0" w:before="0" w:line="240" w:lineRule="auto"/>
               <w:jc w:val="left"/>
             </w:pPr>
@@ -7422,6 +7599,7 @@
           </w:tcPr>
           <w:p>
             <w:pPr>
+              <w:keepNext/>
               <w:spacing w:after="0" w:before="0" w:line="240" w:lineRule="auto"/>
               <w:jc w:val="left"/>
             </w:pPr>
@@ -7465,6 +7643,7 @@
           </w:tcPr>
           <w:p>
             <w:pPr>
+              <w:keepNext/>
               <w:spacing w:after="0" w:before="0" w:line="240" w:lineRule="auto"/>
               <w:jc w:val="left"/>
             </w:pPr>
@@ -7501,6 +7680,7 @@
           </w:tcPr>
           <w:p>
             <w:pPr>
+              <w:keepNext/>
               <w:spacing w:after="0" w:before="0" w:line="240" w:lineRule="auto"/>
               <w:jc w:val="left"/>
             </w:pPr>
@@ -7537,6 +7717,7 @@
           </w:tcPr>
           <w:p>
             <w:pPr>
+              <w:keepNext/>
               <w:spacing w:after="0" w:before="0" w:line="240" w:lineRule="auto"/>
               <w:jc w:val="left"/>
             </w:pPr>
@@ -7567,6 +7748,7 @@
           </w:tcPr>
           <w:p>
             <w:pPr>
+              <w:keepNext/>
               <w:spacing w:after="0" w:before="0" w:line="240" w:lineRule="auto"/>
               <w:jc w:val="left"/>
             </w:pPr>
@@ -7603,6 +7785,7 @@
           </w:tcPr>
           <w:p>
             <w:pPr>
+              <w:keepNext/>
               <w:spacing w:after="0" w:before="0" w:line="240" w:lineRule="auto"/>
               <w:jc w:val="left"/>
             </w:pPr>
@@ -7640,6 +7823,7 @@
           </w:tcPr>
           <w:p>
             <w:pPr>
+              <w:keepNext/>
               <w:spacing w:after="0" w:before="0" w:line="240" w:lineRule="auto"/>
               <w:jc w:val="left"/>
             </w:pPr>
@@ -7670,6 +7854,7 @@
           </w:tcPr>
           <w:p>
             <w:pPr>
+              <w:keepNext w:val="false"/>
               <w:spacing w:after="0" w:before="0" w:line="240" w:lineRule="auto"/>
               <w:jc w:val="left"/>
             </w:pPr>
@@ -7706,6 +7891,7 @@
           </w:tcPr>
           <w:p>
             <w:pPr>
+              <w:keepNext w:val="false"/>
               <w:spacing w:after="0" w:before="0" w:line="240" w:lineRule="auto"/>
               <w:jc w:val="left"/>
             </w:pPr>
@@ -7742,6 +7928,7 @@
           </w:tcPr>
           <w:p>
             <w:pPr>
+              <w:keepNext w:val="false"/>
               <w:spacing w:after="0" w:before="0" w:line="240" w:lineRule="auto"/>
               <w:jc w:val="left"/>
             </w:pPr>
@@ -7820,6 +8007,7 @@
           </w:tcPr>
           <w:p>
             <w:pPr>
+              <w:keepNext/>
               <w:spacing w:after="0" w:before="0" w:line="240" w:lineRule="auto"/>
               <w:jc w:val="center"/>
             </w:pPr>
@@ -7857,6 +8045,7 @@
           </w:tcPr>
           <w:p>
             <w:pPr>
+              <w:keepNext/>
               <w:spacing w:after="0" w:before="0" w:line="240" w:lineRule="auto"/>
               <w:jc w:val="center"/>
             </w:pPr>
@@ -7894,6 +8083,7 @@
           </w:tcPr>
           <w:p>
             <w:pPr>
+              <w:keepNext/>
               <w:spacing w:after="0" w:before="0" w:line="240" w:lineRule="auto"/>
               <w:jc w:val="center"/>
             </w:pPr>
@@ -7931,6 +8121,7 @@
           </w:tcPr>
           <w:p>
             <w:pPr>
+              <w:keepNext/>
               <w:spacing w:after="0" w:before="0" w:line="240" w:lineRule="auto"/>
               <w:jc w:val="center"/>
             </w:pPr>
@@ -7968,6 +8159,7 @@
           </w:tcPr>
           <w:p>
             <w:pPr>
+              <w:keepNext/>
               <w:spacing w:after="0" w:before="0" w:line="240" w:lineRule="auto"/>
               <w:jc w:val="center"/>
             </w:pPr>
@@ -8010,6 +8202,7 @@
           </w:tcPr>
           <w:p>
             <w:pPr>
+              <w:keepNext/>
               <w:spacing w:after="0" w:before="0" w:line="240" w:lineRule="auto"/>
               <w:jc w:val="left"/>
             </w:pPr>
@@ -8046,6 +8239,7 @@
           </w:tcPr>
           <w:p>
             <w:pPr>
+              <w:keepNext/>
               <w:spacing w:after="0" w:before="0" w:line="240" w:lineRule="auto"/>
               <w:jc w:val="left"/>
             </w:pPr>
@@ -8083,6 +8277,7 @@
           </w:tcPr>
           <w:p>
             <w:pPr>
+              <w:keepNext/>
               <w:spacing w:after="0" w:before="0" w:line="240" w:lineRule="auto"/>
               <w:jc w:val="left"/>
             </w:pPr>
@@ -8107,6 +8302,7 @@
           </w:tcPr>
           <w:p>
             <w:pPr>
+              <w:keepNext/>
               <w:spacing w:after="0" w:before="0" w:line="240" w:lineRule="auto"/>
               <w:jc w:val="left"/>
             </w:pPr>
@@ -8144,6 +8340,7 @@
           </w:tcPr>
           <w:p>
             <w:pPr>
+              <w:keepNext/>
               <w:spacing w:after="0" w:before="0" w:line="240" w:lineRule="auto"/>
               <w:jc w:val="left"/>
             </w:pPr>
@@ -8174,6 +8371,7 @@
           </w:tcPr>
           <w:p>
             <w:pPr>
+              <w:keepNext/>
               <w:spacing w:after="0" w:before="0" w:line="240" w:lineRule="auto"/>
               <w:jc w:val="left"/>
             </w:pPr>
@@ -8210,6 +8408,7 @@
           </w:tcPr>
           <w:p>
             <w:pPr>
+              <w:keepNext/>
               <w:spacing w:after="0" w:before="0" w:line="240" w:lineRule="auto"/>
               <w:jc w:val="left"/>
             </w:pPr>
@@ -8247,6 +8446,7 @@
           </w:tcPr>
           <w:p>
             <w:pPr>
+              <w:keepNext/>
               <w:spacing w:after="0" w:before="0" w:line="240" w:lineRule="auto"/>
               <w:jc w:val="left"/>
             </w:pPr>
@@ -8271,6 +8471,7 @@
           </w:tcPr>
           <w:p>
             <w:pPr>
+              <w:keepNext/>
               <w:spacing w:after="0" w:before="0" w:line="240" w:lineRule="auto"/>
               <w:jc w:val="left"/>
             </w:pPr>
@@ -8308,6 +8509,7 @@
           </w:tcPr>
           <w:p>
             <w:pPr>
+              <w:keepNext/>
               <w:spacing w:after="0" w:before="0" w:line="240" w:lineRule="auto"/>
               <w:jc w:val="left"/>
             </w:pPr>
@@ -8338,6 +8540,7 @@
           </w:tcPr>
           <w:p>
             <w:pPr>
+              <w:keepNext w:val="false"/>
               <w:spacing w:after="0" w:before="0" w:line="240" w:lineRule="auto"/>
               <w:jc w:val="left"/>
             </w:pPr>
@@ -8374,6 +8577,7 @@
           </w:tcPr>
           <w:p>
             <w:pPr>
+              <w:keepNext w:val="false"/>
               <w:spacing w:after="0" w:before="0" w:line="240" w:lineRule="auto"/>
               <w:jc w:val="left"/>
             </w:pPr>
@@ -8411,6 +8615,7 @@
           </w:tcPr>
           <w:p>
             <w:pPr>
+              <w:keepNext w:val="false"/>
               <w:spacing w:after="0" w:before="0" w:line="240" w:lineRule="auto"/>
               <w:jc w:val="left"/>
             </w:pPr>
@@ -8435,6 +8640,7 @@
           </w:tcPr>
           <w:p>
             <w:pPr>
+              <w:keepNext w:val="false"/>
               <w:spacing w:after="0" w:before="0" w:line="240" w:lineRule="auto"/>
               <w:jc w:val="left"/>
             </w:pPr>
@@ -8472,6 +8678,7 @@
           </w:tcPr>
           <w:p>
             <w:pPr>
+              <w:keepNext w:val="false"/>
               <w:spacing w:after="0" w:before="0" w:line="240" w:lineRule="auto"/>
               <w:jc w:val="left"/>
             </w:pPr>

</xml_diff>

<commit_message>
Đối chiếu toàn văn BLLĐ, BLHS, Luật 04/2017, NĐ 80/2021, NĐ 30/2020, Luật Doanh nghiệp Đ43; xuất lại Word bị ảnh hưởng
Co-Authored-By: Claude Opus 5.5 <noreply@anthropic.com>
Claude-Session: https://claude.ai/code/session_01EYfrLZFALxho7iwpK7bTVa
</commit_message>
<xml_diff>
--- a/templates/01-xac-dinh-cap-do/phieu-xac-dinh-cap-do.docx
+++ b/templates/01-xac-dinh-cap-do/phieu-xac-dinh-cap-do.docx
@@ -5171,8 +5171,8 @@
         <w:tblLayout w:type="autofit"/>
       </w:tblPr>
       <w:tblGrid>
-        <w:gridCol w:w="4308"/>
-        <w:gridCol w:w="4717"/>
+        <w:gridCol w:w="4050"/>
+        <w:gridCol w:w="4975"/>
       </w:tblGrid>
       <w:tr>
         <w:trPr>
@@ -5181,7 +5181,7 @@
         </w:trPr>
         <w:tc>
           <w:tcPr>
-            <w:tcW w:type="dxa" w:w="4308"/>
+            <w:tcW w:type="dxa" w:w="4050"/>
             <w:tcBorders>
               <w:top w:val="single" w:color="000000" w:sz="4"/>
               <w:left w:val="single" w:color="000000" w:sz="4"/>
@@ -5219,7 +5219,7 @@
         </w:tc>
         <w:tc>
           <w:tcPr>
-            <w:tcW w:type="dxa" w:w="4717"/>
+            <w:tcW w:type="dxa" w:w="4975"/>
             <w:tcBorders>
               <w:top w:val="single" w:color="000000" w:sz="4"/>
               <w:left w:val="single" w:color="000000" w:sz="4"/>
@@ -5263,7 +5263,7 @@
         </w:trPr>
         <w:tc>
           <w:tcPr>
-            <w:tcW w:type="dxa" w:w="4308"/>
+            <w:tcW w:type="dxa" w:w="4050"/>
             <w:tcBorders>
               <w:top w:val="single" w:color="000000" w:sz="4"/>
               <w:left w:val="single" w:color="000000" w:sz="4"/>
@@ -5300,7 +5300,7 @@
         </w:tc>
         <w:tc>
           <w:tcPr>
-            <w:tcW w:type="dxa" w:w="4717"/>
+            <w:tcW w:type="dxa" w:w="4975"/>
             <w:tcBorders>
               <w:top w:val="single" w:color="000000" w:sz="4"/>
               <w:left w:val="single" w:color="000000" w:sz="4"/>
@@ -5344,7 +5344,7 @@
         </w:trPr>
         <w:tc>
           <w:tcPr>
-            <w:tcW w:type="dxa" w:w="4308"/>
+            <w:tcW w:type="dxa" w:w="4050"/>
             <w:tcBorders>
               <w:top w:val="single" w:color="000000" w:sz="4"/>
               <w:left w:val="single" w:color="000000" w:sz="4"/>
@@ -5381,7 +5381,7 @@
         </w:tc>
         <w:tc>
           <w:tcPr>
-            <w:tcW w:type="dxa" w:w="4717"/>
+            <w:tcW w:type="dxa" w:w="4975"/>
             <w:tcBorders>
               <w:top w:val="single" w:color="000000" w:sz="4"/>
               <w:left w:val="single" w:color="000000" w:sz="4"/>
@@ -5425,44 +5425,44 @@
         </w:trPr>
         <w:tc>
           <w:tcPr>
-            <w:tcW w:type="dxa" w:w="4308"/>
-            <w:tcBorders>
-              <w:top w:val="single" w:color="000000" w:sz="4"/>
-              <w:left w:val="single" w:color="000000" w:sz="4"/>
-              <w:bottom w:val="single" w:color="000000" w:sz="4"/>
-              <w:right w:val="single" w:color="000000" w:sz="4"/>
-            </w:tcBorders>
-            <w:tcMar>
-              <w:top w:type="dxa" w:w="30"/>
-              <w:left w:type="dxa" w:w="70"/>
-              <w:bottom w:type="dxa" w:w="30"/>
-              <w:right w:type="dxa" w:w="70"/>
-            </w:tcMar>
-            <w:vAlign w:val="center"/>
-          </w:tcPr>
-          <w:p>
-            <w:pPr>
-              <w:keepNext/>
-              <w:spacing w:after="0" w:before="0" w:line="240" w:lineRule="auto"/>
-              <w:jc w:val="left"/>
-            </w:pPr>
-            <w:r>
-              <w:rPr>
-                <w:rFonts w:ascii="Times New Roman" w:cs="Times New Roman" w:eastAsia="Times New Roman" w:hAnsi="Times New Roman"/>
-                <w:b w:val="false"/>
-                <w:bCs w:val="false"/>
-                <w:i w:val="false"/>
-                <w:iCs w:val="false"/>
-                <w:sz w:val="24"/>
-                <w:szCs w:val="24"/>
-              </w:rPr>
-              <w:t xml:space="preserve">Thuộc danh mục ngành, nghề ĐTKD có điều kiện (Phụ lục IV Luật Đầu tư)?</w:t>
-            </w:r>
-          </w:p>
-        </w:tc>
-        <w:tc>
-          <w:tcPr>
-            <w:tcW w:type="dxa" w:w="4717"/>
+            <w:tcW w:type="dxa" w:w="4050"/>
+            <w:tcBorders>
+              <w:top w:val="single" w:color="000000" w:sz="4"/>
+              <w:left w:val="single" w:color="000000" w:sz="4"/>
+              <w:bottom w:val="single" w:color="000000" w:sz="4"/>
+              <w:right w:val="single" w:color="000000" w:sz="4"/>
+            </w:tcBorders>
+            <w:tcMar>
+              <w:top w:type="dxa" w:w="30"/>
+              <w:left w:type="dxa" w:w="70"/>
+              <w:bottom w:type="dxa" w:w="30"/>
+              <w:right w:type="dxa" w:w="70"/>
+            </w:tcMar>
+            <w:vAlign w:val="center"/>
+          </w:tcPr>
+          <w:p>
+            <w:pPr>
+              <w:keepNext/>
+              <w:spacing w:after="0" w:before="0" w:line="240" w:lineRule="auto"/>
+              <w:jc w:val="left"/>
+            </w:pPr>
+            <w:r>
+              <w:rPr>
+                <w:rFonts w:ascii="Times New Roman" w:cs="Times New Roman" w:eastAsia="Times New Roman" w:hAnsi="Times New Roman"/>
+                <w:b w:val="false"/>
+                <w:bCs w:val="false"/>
+                <w:i w:val="false"/>
+                <w:iCs w:val="false"/>
+                <w:sz w:val="24"/>
+                <w:szCs w:val="24"/>
+              </w:rPr>
+              <w:t xml:space="preserve">Thuộc danh mục ngành, nghề ĐTKD có điều kiện (Phụ lục IV Luật Đầu tư 143/2025/QH15)?</w:t>
+            </w:r>
+          </w:p>
+        </w:tc>
+        <w:tc>
+          <w:tcPr>
+            <w:tcW w:type="dxa" w:w="4975"/>
             <w:tcBorders>
               <w:top w:val="single" w:color="000000" w:sz="4"/>
               <w:left w:val="single" w:color="000000" w:sz="4"/>
@@ -5530,7 +5530,7 @@
         </w:trPr>
         <w:tc>
           <w:tcPr>
-            <w:tcW w:type="dxa" w:w="4308"/>
+            <w:tcW w:type="dxa" w:w="4050"/>
             <w:tcBorders>
               <w:top w:val="single" w:color="000000" w:sz="4"/>
               <w:left w:val="single" w:color="000000" w:sz="4"/>
@@ -5567,7 +5567,7 @@
         </w:tc>
         <w:tc>
           <w:tcPr>
-            <w:tcW w:type="dxa" w:w="4717"/>
+            <w:tcW w:type="dxa" w:w="4975"/>
             <w:tcBorders>
               <w:top w:val="single" w:color="000000" w:sz="4"/>
               <w:left w:val="single" w:color="000000" w:sz="4"/>
@@ -5611,19 +5611,7 @@
                 <w:sz w:val="24"/>
                 <w:szCs w:val="24"/>
               </w:rPr>
-              <w:t xml:space="preserve"> — </w:t>
-            </w:r>
-            <w:r>
-              <w:rPr>
-                <w:rFonts w:ascii="Times New Roman" w:cs="Times New Roman" w:eastAsia="Times New Roman" w:hAnsi="Times New Roman"/>
-                <w:b/>
-                <w:bCs/>
-                <w:i w:val="false"/>
-                <w:iCs w:val="false"/>
-                <w:sz w:val="24"/>
-                <w:szCs w:val="24"/>
-              </w:rPr>
-              <w:t xml:space="preserve">[CẦN ĐỐI CHIẾU] Phụ lục IV Luật Đầu tư chưa có trong repo</w:t>
+              <w:t xml:space="preserve"> — toàn văn Phụ lục IV: sources/van-ban-goc/toan-van/luat-143-2025-qh15-dau-tu.txt (hiệu lực 01/7/2026, Đ51.2); các mục hay gặp: tieu-chi-cap-do.md mục 6.2</w:t>
             </w:r>
           </w:p>
         </w:tc>
@@ -5635,7 +5623,7 @@
         </w:trPr>
         <w:tc>
           <w:tcPr>
-            <w:tcW w:type="dxa" w:w="4308"/>
+            <w:tcW w:type="dxa" w:w="4050"/>
             <w:tcBorders>
               <w:top w:val="single" w:color="000000" w:sz="4"/>
               <w:left w:val="single" w:color="000000" w:sz="4"/>
@@ -5672,7 +5660,7 @@
         </w:tc>
         <w:tc>
           <w:tcPr>
-            <w:tcW w:type="dxa" w:w="4717"/>
+            <w:tcW w:type="dxa" w:w="4975"/>
             <w:tcBorders>
               <w:top w:val="single" w:color="000000" w:sz="4"/>
               <w:left w:val="single" w:color="000000" w:sz="4"/>

</xml_diff>